<commit_message>
Made changes on Formatting Del 2
</commit_message>
<xml_diff>
--- a/Deliverable2.docx
+++ b/Deliverable2.docx
@@ -2,10 +2,1267 @@
 <file path=word/document.xml><?xml version="1.0" encoding="utf-8"?>
 <w:document xmlns:wpc="http://schemas.microsoft.com/office/word/2010/wordprocessingCanvas" xmlns:cx="http://schemas.microsoft.com/office/drawing/2014/chartex" xmlns:cx1="http://schemas.microsoft.com/office/drawing/2015/9/8/chartex" xmlns:cx2="http://schemas.microsoft.com/office/drawing/2015/10/21/chartex" xmlns:cx3="http://schemas.microsoft.com/office/drawing/2016/5/9/chartex" xmlns:cx4="http://schemas.microsoft.com/office/drawing/2016/5/10/chartex" xmlns:cx5="http://schemas.microsoft.com/office/drawing/2016/5/11/chartex" xmlns:cx6="http://schemas.microsoft.com/office/drawing/2016/5/12/chartex" xmlns:cx7="http://schemas.microsoft.com/office/drawing/2016/5/13/chartex" xmlns:cx8="http://schemas.microsoft.com/office/drawing/2016/5/14/chartex" xmlns:mc="http://schemas.openxmlformats.org/markup-compatibility/2006" xmlns:aink="http://schemas.microsoft.com/office/drawing/2016/ink" xmlns:am3d="http://schemas.microsoft.com/office/drawing/2017/model3d" xmlns:o="urn:schemas-microsoft-com:office:office" xmlns:oel="http://schemas.microsoft.com/office/2019/extlst" xmlns:r="http://schemas.openxmlformats.org/officeDocument/2006/relationships" xmlns:m="http://schemas.openxmlformats.org/officeDocument/2006/math" xmlns:v="urn:schemas-microsoft-com:vml" xmlns:wp14="http://schemas.microsoft.com/office/word/2010/wordprocessingDrawing" xmlns:wp="http://schemas.openxmlformats.org/drawingml/2006/wordprocessingDrawing" xmlns:w10="urn:schemas-microsoft-com:office:word" xmlns:w="http://schemas.openxmlformats.org/wordprocessingml/2006/main" xmlns:w14="http://schemas.microsoft.com/office/word/2010/wordml" xmlns:w15="http://schemas.microsoft.com/office/word/2012/wordml" xmlns:w16cex="http://schemas.microsoft.com/office/word/2018/wordml/cex" xmlns:w16cid="http://schemas.microsoft.com/office/word/2016/wordml/cid" xmlns:w16="http://schemas.microsoft.com/office/word/2018/wordml" xmlns:w16sdtdh="http://schemas.microsoft.com/office/word/2020/wordml/sdtdatahash" xmlns:w16se="http://schemas.microsoft.com/office/word/2015/wordml/symex" xmlns:wpg="http://schemas.microsoft.com/office/word/2010/wordprocessingGroup" xmlns:wpi="http://schemas.microsoft.com/office/word/2010/wordprocessingInk" xmlns:wne="http://schemas.microsoft.com/office/word/2006/wordml" xmlns:wps="http://schemas.microsoft.com/office/word/2010/wordprocessingShape" mc:Ignorable="w14 w15 w16se w16cid w16 w16cex w16sdtdh wp14">
   <w:body>
+    <w:sdt>
+      <w:sdtPr>
+        <w:id w:val="1959909495"/>
+        <w:docPartObj>
+          <w:docPartGallery w:val="Cover Pages"/>
+          <w:docPartUnique/>
+        </w:docPartObj>
+      </w:sdtPr>
+      <w:sdtContent>
+        <w:p>
+          <w:r>
+            <w:rPr>
+              <w:noProof/>
+            </w:rPr>
+            <mc:AlternateContent>
+              <mc:Choice Requires="wpg">
+                <w:drawing>
+                  <wp:anchor distT="0" distB="0" distL="114300" distR="114300" simplePos="0" relativeHeight="251663373" behindDoc="0" locked="0" layoutInCell="1" allowOverlap="1" wp14:anchorId="4D6C90BE" wp14:editId="58F9A196">
+                    <wp:simplePos x="0" y="0"/>
+                    <wp:positionH relativeFrom="page">
+                      <wp:align>center</wp:align>
+                    </wp:positionH>
+                    <mc:AlternateContent>
+                      <mc:Choice Requires="wp14">
+                        <wp:positionV relativeFrom="page">
+                          <wp14:pctPosVOffset>2300</wp14:pctPosVOffset>
+                        </wp:positionV>
+                      </mc:Choice>
+                      <mc:Fallback>
+                        <wp:positionV relativeFrom="page">
+                          <wp:posOffset>231140</wp:posOffset>
+                        </wp:positionV>
+                      </mc:Fallback>
+                    </mc:AlternateContent>
+                    <wp:extent cx="7315200" cy="1215391"/>
+                    <wp:effectExtent l="0" t="0" r="1270" b="1905"/>
+                    <wp:wrapNone/>
+                    <wp:docPr id="149" name="Group 149"/>
+                    <wp:cNvGraphicFramePr/>
+                    <a:graphic xmlns:a="http://schemas.openxmlformats.org/drawingml/2006/main">
+                      <a:graphicData uri="http://schemas.microsoft.com/office/word/2010/wordprocessingGroup">
+                        <wpg:wgp>
+                          <wpg:cNvGrpSpPr/>
+                          <wpg:grpSpPr>
+                            <a:xfrm>
+                              <a:off x="0" y="0"/>
+                              <a:ext cx="7315200" cy="1215391"/>
+                              <a:chOff x="0" y="-1"/>
+                              <a:chExt cx="7315200" cy="1216153"/>
+                            </a:xfrm>
+                          </wpg:grpSpPr>
+                          <wps:wsp>
+                            <wps:cNvPr id="150" name="Rectangle 51"/>
+                            <wps:cNvSpPr/>
+                            <wps:spPr>
+                              <a:xfrm>
+                                <a:off x="0" y="-1"/>
+                                <a:ext cx="7315200" cy="1130373"/>
+                              </a:xfrm>
+                              <a:custGeom>
+                                <a:avLst/>
+                                <a:gdLst>
+                                  <a:gd name="connsiteX0" fmla="*/ 0 w 7312660"/>
+                                  <a:gd name="connsiteY0" fmla="*/ 0 h 1215390"/>
+                                  <a:gd name="connsiteX1" fmla="*/ 7312660 w 7312660"/>
+                                  <a:gd name="connsiteY1" fmla="*/ 0 h 1215390"/>
+                                  <a:gd name="connsiteX2" fmla="*/ 7312660 w 7312660"/>
+                                  <a:gd name="connsiteY2" fmla="*/ 1215390 h 1215390"/>
+                                  <a:gd name="connsiteX3" fmla="*/ 0 w 7312660"/>
+                                  <a:gd name="connsiteY3" fmla="*/ 1215390 h 1215390"/>
+                                  <a:gd name="connsiteX4" fmla="*/ 0 w 7312660"/>
+                                  <a:gd name="connsiteY4" fmla="*/ 0 h 1215390"/>
+                                  <a:gd name="connsiteX0" fmla="*/ 0 w 7312660"/>
+                                  <a:gd name="connsiteY0" fmla="*/ 0 h 1215390"/>
+                                  <a:gd name="connsiteX1" fmla="*/ 7312660 w 7312660"/>
+                                  <a:gd name="connsiteY1" fmla="*/ 0 h 1215390"/>
+                                  <a:gd name="connsiteX2" fmla="*/ 7312660 w 7312660"/>
+                                  <a:gd name="connsiteY2" fmla="*/ 1215390 h 1215390"/>
+                                  <a:gd name="connsiteX3" fmla="*/ 3667125 w 7312660"/>
+                                  <a:gd name="connsiteY3" fmla="*/ 1209675 h 1215390"/>
+                                  <a:gd name="connsiteX4" fmla="*/ 0 w 7312660"/>
+                                  <a:gd name="connsiteY4" fmla="*/ 1215390 h 1215390"/>
+                                  <a:gd name="connsiteX5" fmla="*/ 0 w 7312660"/>
+                                  <a:gd name="connsiteY5" fmla="*/ 0 h 1215390"/>
+                                  <a:gd name="connsiteX0" fmla="*/ 0 w 7312660"/>
+                                  <a:gd name="connsiteY0" fmla="*/ 0 h 1215390"/>
+                                  <a:gd name="connsiteX1" fmla="*/ 7312660 w 7312660"/>
+                                  <a:gd name="connsiteY1" fmla="*/ 0 h 1215390"/>
+                                  <a:gd name="connsiteX2" fmla="*/ 7312660 w 7312660"/>
+                                  <a:gd name="connsiteY2" fmla="*/ 1215390 h 1215390"/>
+                                  <a:gd name="connsiteX3" fmla="*/ 3619500 w 7312660"/>
+                                  <a:gd name="connsiteY3" fmla="*/ 733425 h 1215390"/>
+                                  <a:gd name="connsiteX4" fmla="*/ 0 w 7312660"/>
+                                  <a:gd name="connsiteY4" fmla="*/ 1215390 h 1215390"/>
+                                  <a:gd name="connsiteX5" fmla="*/ 0 w 7312660"/>
+                                  <a:gd name="connsiteY5" fmla="*/ 0 h 1215390"/>
+                                  <a:gd name="connsiteX0" fmla="*/ 0 w 7312660"/>
+                                  <a:gd name="connsiteY0" fmla="*/ 0 h 1215390"/>
+                                  <a:gd name="connsiteX1" fmla="*/ 7312660 w 7312660"/>
+                                  <a:gd name="connsiteY1" fmla="*/ 0 h 1215390"/>
+                                  <a:gd name="connsiteX2" fmla="*/ 7312660 w 7312660"/>
+                                  <a:gd name="connsiteY2" fmla="*/ 1129665 h 1215390"/>
+                                  <a:gd name="connsiteX3" fmla="*/ 3619500 w 7312660"/>
+                                  <a:gd name="connsiteY3" fmla="*/ 733425 h 1215390"/>
+                                  <a:gd name="connsiteX4" fmla="*/ 0 w 7312660"/>
+                                  <a:gd name="connsiteY4" fmla="*/ 1215390 h 1215390"/>
+                                  <a:gd name="connsiteX5" fmla="*/ 0 w 7312660"/>
+                                  <a:gd name="connsiteY5" fmla="*/ 0 h 1215390"/>
+                                  <a:gd name="connsiteX0" fmla="*/ 9525 w 7322185"/>
+                                  <a:gd name="connsiteY0" fmla="*/ 0 h 1129665"/>
+                                  <a:gd name="connsiteX1" fmla="*/ 7322185 w 7322185"/>
+                                  <a:gd name="connsiteY1" fmla="*/ 0 h 1129665"/>
+                                  <a:gd name="connsiteX2" fmla="*/ 7322185 w 7322185"/>
+                                  <a:gd name="connsiteY2" fmla="*/ 1129665 h 1129665"/>
+                                  <a:gd name="connsiteX3" fmla="*/ 3629025 w 7322185"/>
+                                  <a:gd name="connsiteY3" fmla="*/ 733425 h 1129665"/>
+                                  <a:gd name="connsiteX4" fmla="*/ 0 w 7322185"/>
+                                  <a:gd name="connsiteY4" fmla="*/ 1091565 h 1129665"/>
+                                  <a:gd name="connsiteX5" fmla="*/ 9525 w 7322185"/>
+                                  <a:gd name="connsiteY5" fmla="*/ 0 h 1129665"/>
+                                  <a:gd name="connsiteX0" fmla="*/ 0 w 7312660"/>
+                                  <a:gd name="connsiteY0" fmla="*/ 0 h 1129665"/>
+                                  <a:gd name="connsiteX1" fmla="*/ 7312660 w 7312660"/>
+                                  <a:gd name="connsiteY1" fmla="*/ 0 h 1129665"/>
+                                  <a:gd name="connsiteX2" fmla="*/ 7312660 w 7312660"/>
+                                  <a:gd name="connsiteY2" fmla="*/ 1129665 h 1129665"/>
+                                  <a:gd name="connsiteX3" fmla="*/ 3619500 w 7312660"/>
+                                  <a:gd name="connsiteY3" fmla="*/ 733425 h 1129665"/>
+                                  <a:gd name="connsiteX4" fmla="*/ 0 w 7312660"/>
+                                  <a:gd name="connsiteY4" fmla="*/ 1091565 h 1129665"/>
+                                  <a:gd name="connsiteX5" fmla="*/ 0 w 7312660"/>
+                                  <a:gd name="connsiteY5" fmla="*/ 0 h 1129665"/>
+                                </a:gdLst>
+                                <a:ahLst/>
+                                <a:cxnLst>
+                                  <a:cxn ang="0">
+                                    <a:pos x="connsiteX0" y="connsiteY0"/>
+                                  </a:cxn>
+                                  <a:cxn ang="0">
+                                    <a:pos x="connsiteX1" y="connsiteY1"/>
+                                  </a:cxn>
+                                  <a:cxn ang="0">
+                                    <a:pos x="connsiteX2" y="connsiteY2"/>
+                                  </a:cxn>
+                                  <a:cxn ang="0">
+                                    <a:pos x="connsiteX3" y="connsiteY3"/>
+                                  </a:cxn>
+                                  <a:cxn ang="0">
+                                    <a:pos x="connsiteX4" y="connsiteY4"/>
+                                  </a:cxn>
+                                  <a:cxn ang="0">
+                                    <a:pos x="connsiteX5" y="connsiteY5"/>
+                                  </a:cxn>
+                                </a:cxnLst>
+                                <a:rect l="l" t="t" r="r" b="b"/>
+                                <a:pathLst>
+                                  <a:path w="7312660" h="1129665">
+                                    <a:moveTo>
+                                      <a:pt x="0" y="0"/>
+                                    </a:moveTo>
+                                    <a:lnTo>
+                                      <a:pt x="7312660" y="0"/>
+                                    </a:lnTo>
+                                    <a:lnTo>
+                                      <a:pt x="7312660" y="1129665"/>
+                                    </a:lnTo>
+                                    <a:lnTo>
+                                      <a:pt x="3619500" y="733425"/>
+                                    </a:lnTo>
+                                    <a:lnTo>
+                                      <a:pt x="0" y="1091565"/>
+                                    </a:lnTo>
+                                    <a:lnTo>
+                                      <a:pt x="0" y="0"/>
+                                    </a:lnTo>
+                                    <a:close/>
+                                  </a:path>
+                                </a:pathLst>
+                              </a:custGeom>
+                              <a:ln>
+                                <a:noFill/>
+                              </a:ln>
+                            </wps:spPr>
+                            <wps:style>
+                              <a:lnRef idx="2">
+                                <a:schemeClr val="accent1">
+                                  <a:shade val="50000"/>
+                                </a:schemeClr>
+                              </a:lnRef>
+                              <a:fillRef idx="1">
+                                <a:schemeClr val="accent1"/>
+                              </a:fillRef>
+                              <a:effectRef idx="0">
+                                <a:schemeClr val="accent1"/>
+                              </a:effectRef>
+                              <a:fontRef idx="minor">
+                                <a:schemeClr val="lt1"/>
+                              </a:fontRef>
+                            </wps:style>
+                            <wps:bodyPr rot="0" spcFirstLastPara="0" vertOverflow="overflow" horzOverflow="overflow" vert="horz" wrap="square" lIns="91440" tIns="45720" rIns="91440" bIns="45720" numCol="1" spcCol="0" rtlCol="0" fromWordArt="0" anchor="ctr" anchorCtr="0" forceAA="0" compatLnSpc="1">
+                              <a:prstTxWarp prst="textNoShape">
+                                <a:avLst/>
+                              </a:prstTxWarp>
+                              <a:noAutofit/>
+                            </wps:bodyPr>
+                          </wps:wsp>
+                          <wps:wsp>
+                            <wps:cNvPr id="151" name="Rectangle 151"/>
+                            <wps:cNvSpPr/>
+                            <wps:spPr>
+                              <a:xfrm>
+                                <a:off x="0" y="0"/>
+                                <a:ext cx="7315200" cy="1216152"/>
+                              </a:xfrm>
+                              <a:prstGeom prst="rect">
+                                <a:avLst/>
+                              </a:prstGeom>
+                              <a:blipFill>
+                                <a:blip r:embed="rId9"/>
+                                <a:stretch>
+                                  <a:fillRect r="-7574"/>
+                                </a:stretch>
+                              </a:blipFill>
+                              <a:ln>
+                                <a:noFill/>
+                              </a:ln>
+                            </wps:spPr>
+                            <wps:style>
+                              <a:lnRef idx="2">
+                                <a:schemeClr val="accent1">
+                                  <a:shade val="50000"/>
+                                </a:schemeClr>
+                              </a:lnRef>
+                              <a:fillRef idx="1">
+                                <a:schemeClr val="accent1"/>
+                              </a:fillRef>
+                              <a:effectRef idx="0">
+                                <a:schemeClr val="accent1"/>
+                              </a:effectRef>
+                              <a:fontRef idx="minor">
+                                <a:schemeClr val="lt1"/>
+                              </a:fontRef>
+                            </wps:style>
+                            <wps:bodyPr rot="0" spcFirstLastPara="0" vertOverflow="overflow" horzOverflow="overflow" vert="horz" wrap="square" lIns="91440" tIns="45720" rIns="91440" bIns="45720" numCol="1" spcCol="0" rtlCol="0" fromWordArt="0" anchor="ctr" anchorCtr="0" forceAA="0" compatLnSpc="1">
+                              <a:prstTxWarp prst="textNoShape">
+                                <a:avLst/>
+                              </a:prstTxWarp>
+                              <a:noAutofit/>
+                            </wps:bodyPr>
+                          </wps:wsp>
+                        </wpg:wgp>
+                      </a:graphicData>
+                    </a:graphic>
+                    <wp14:sizeRelH relativeFrom="page">
+                      <wp14:pctWidth>94100</wp14:pctWidth>
+                    </wp14:sizeRelH>
+                    <wp14:sizeRelV relativeFrom="page">
+                      <wp14:pctHeight>12100</wp14:pctHeight>
+                    </wp14:sizeRelV>
+                  </wp:anchor>
+                </w:drawing>
+              </mc:Choice>
+              <mc:Fallback>
+                <w:pict>
+                  <v:group w14:anchorId="7F3722B3" id="Group 149" o:spid="_x0000_s1026" style="position:absolute;margin-left:0;margin-top:0;width:8in;height:95.7pt;z-index:251663373;mso-width-percent:941;mso-height-percent:121;mso-top-percent:23;mso-position-horizontal:center;mso-position-horizontal-relative:page;mso-position-vertical-relative:page;mso-width-percent:941;mso-height-percent:121;mso-top-percent:23" coordorigin="" coordsize="73152,12161" o:gfxdata="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">
+                    <v:shape id="Rectangle 51" o:spid="_x0000_s1027" style="position:absolute;width:73152;height:11303;visibility:visible;mso-wrap-style:square;v-text-anchor:middle" coordsize="7312660,1129665" o:gfxdata="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" path="m,l7312660,r,1129665l3619500,733425,,1091565,,xe" fillcolor="#156082 [3204]" stroked="f" strokeweight="1pt">
+                      <v:stroke joinstyle="miter"/>
+                      <v:path arrowok="t" o:connecttype="custom" o:connectlocs="0,0;7315200,0;7315200,1130373;3620757,733885;0,1092249;0,0" o:connectangles="0,0,0,0,0,0"/>
+                    </v:shape>
+                    <v:rect id="Rectangle 151" o:spid="_x0000_s1028" style="position:absolute;width:73152;height:12161;visibility:visible;mso-wrap-style:square;v-text-anchor:middle" o:gfxdata="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" stroked="f" strokeweight="1pt">
+                      <v:fill r:id="rId10" o:title="" recolor="t" rotate="t" type="frame"/>
+                    </v:rect>
+                    <w10:wrap anchorx="page" anchory="page"/>
+                  </v:group>
+                </w:pict>
+              </mc:Fallback>
+            </mc:AlternateContent>
+          </w:r>
+          <w:r>
+            <w:rPr>
+              <w:noProof/>
+            </w:rPr>
+            <mc:AlternateContent>
+              <mc:Choice Requires="wps">
+                <w:drawing>
+                  <wp:anchor distT="0" distB="0" distL="114300" distR="114300" simplePos="0" relativeHeight="251660301" behindDoc="0" locked="0" layoutInCell="1" allowOverlap="1" wp14:anchorId="107DA495" wp14:editId="281F1F9B">
+                    <wp:simplePos x="0" y="0"/>
+                    <wp:positionH relativeFrom="page">
+                      <wp:align>center</wp:align>
+                    </wp:positionH>
+                    <mc:AlternateContent>
+                      <mc:Choice Requires="wp14">
+                        <wp:positionV relativeFrom="page">
+                          <wp14:pctPosVOffset>30000</wp14:pctPosVOffset>
+                        </wp:positionV>
+                      </mc:Choice>
+                      <mc:Fallback>
+                        <wp:positionV relativeFrom="page">
+                          <wp:posOffset>3017520</wp:posOffset>
+                        </wp:positionV>
+                      </mc:Fallback>
+                    </mc:AlternateContent>
+                    <wp:extent cx="7315200" cy="3638550"/>
+                    <wp:effectExtent l="0" t="0" r="0" b="6350"/>
+                    <wp:wrapSquare wrapText="bothSides"/>
+                    <wp:docPr id="154" name="Text Box 154"/>
+                    <wp:cNvGraphicFramePr/>
+                    <a:graphic xmlns:a="http://schemas.openxmlformats.org/drawingml/2006/main">
+                      <a:graphicData uri="http://schemas.microsoft.com/office/word/2010/wordprocessingShape">
+                        <wps:wsp>
+                          <wps:cNvSpPr txBox="1"/>
+                          <wps:spPr>
+                            <a:xfrm>
+                              <a:off x="0" y="0"/>
+                              <a:ext cx="7315200" cy="3638550"/>
+                            </a:xfrm>
+                            <a:prstGeom prst="rect">
+                              <a:avLst/>
+                            </a:prstGeom>
+                            <a:noFill/>
+                            <a:ln w="6350">
+                              <a:noFill/>
+                            </a:ln>
+                            <a:effectLst/>
+                          </wps:spPr>
+                          <wps:style>
+                            <a:lnRef idx="0">
+                              <a:schemeClr val="accent1"/>
+                            </a:lnRef>
+                            <a:fillRef idx="0">
+                              <a:schemeClr val="accent1"/>
+                            </a:fillRef>
+                            <a:effectRef idx="0">
+                              <a:schemeClr val="accent1"/>
+                            </a:effectRef>
+                            <a:fontRef idx="minor">
+                              <a:schemeClr val="dk1"/>
+                            </a:fontRef>
+                          </wps:style>
+                          <wps:txbx>
+                            <w:txbxContent>
+                              <w:p>
+                                <w:pPr>
+                                  <w:jc w:val="right"/>
+                                  <w:rPr>
+                                    <w:color w:val="156082" w:themeColor="accent1"/>
+                                    <w:sz w:val="64"/>
+                                    <w:szCs w:val="64"/>
+                                  </w:rPr>
+                                </w:pPr>
+                                <w:sdt>
+                                  <w:sdtPr>
+                                    <w:rPr>
+                                      <w:caps/>
+                                      <w:color w:val="156082" w:themeColor="accent1"/>
+                                      <w:sz w:val="64"/>
+                                      <w:szCs w:val="64"/>
+                                    </w:rPr>
+                                    <w:alias w:val="Title"/>
+                                    <w:tag w:val=""/>
+                                    <w:id w:val="630141079"/>
+                                    <w:dataBinding w:prefixMappings="xmlns:ns0='http://purl.org/dc/elements/1.1/' xmlns:ns1='http://schemas.openxmlformats.org/package/2006/metadata/core-properties' " w:xpath="/ns1:coreProperties[1]/ns0:title[1]" w:storeItemID="{6C3C8BC8-F283-45AE-878A-BAB7291924A1}"/>
+                                    <w:text w:multiLine="1"/>
+                                  </w:sdtPr>
+                                  <w:sdtEndPr>
+                                    <w:rPr>
+                                      <w:caps w:val="0"/>
+                                    </w:rPr>
+                                  </w:sdtEndPr>
+                                  <w:sdtContent>
+                                    <w:r>
+                                      <w:rPr>
+                                        <w:caps/>
+                                        <w:color w:val="156082" w:themeColor="accent1"/>
+                                        <w:sz w:val="64"/>
+                                        <w:szCs w:val="64"/>
+                                      </w:rPr>
+                                      <w:t>UBarbershop</w:t>
+                                    </w:r>
+                                  </w:sdtContent>
+                                </w:sdt>
+                              </w:p>
+                              <w:sdt>
+                                <w:sdtPr>
+                                  <w:rPr>
+                                    <w:color w:val="404040" w:themeColor="text1" w:themeTint="BF"/>
+                                    <w:sz w:val="36"/>
+                                    <w:szCs w:val="36"/>
+                                  </w:rPr>
+                                  <w:alias w:val="Subtitle"/>
+                                  <w:tag w:val=""/>
+                                  <w:id w:val="1759551507"/>
+                                  <w:dataBinding w:prefixMappings="xmlns:ns0='http://purl.org/dc/elements/1.1/' xmlns:ns1='http://schemas.openxmlformats.org/package/2006/metadata/core-properties' " w:xpath="/ns1:coreProperties[1]/ns0:subject[1]" w:storeItemID="{6C3C8BC8-F283-45AE-878A-BAB7291924A1}"/>
+                                  <w:text/>
+                                </w:sdtPr>
+                                <w:sdtContent>
+                                  <w:p>
+                                    <w:pPr>
+                                      <w:jc w:val="right"/>
+                                      <w:rPr>
+                                        <w:smallCaps/>
+                                        <w:color w:val="404040" w:themeColor="text1" w:themeTint="BF"/>
+                                        <w:sz w:val="36"/>
+                                        <w:szCs w:val="36"/>
+                                      </w:rPr>
+                                    </w:pPr>
+                                    <w:r>
+                                      <w:rPr>
+                                        <w:color w:val="404040" w:themeColor="text1" w:themeTint="BF"/>
+                                        <w:sz w:val="36"/>
+                                        <w:szCs w:val="36"/>
+                                      </w:rPr>
+                                      <w:t>Deliverable 2</w:t>
+                                    </w:r>
+                                  </w:p>
+                                </w:sdtContent>
+                              </w:sdt>
+                            </w:txbxContent>
+                          </wps:txbx>
+                          <wps:bodyPr rot="0" spcFirstLastPara="0" vertOverflow="overflow" horzOverflow="overflow" vert="horz" wrap="square" lIns="1600200" tIns="0" rIns="685800" bIns="0" numCol="1" spcCol="0" rtlCol="0" fromWordArt="0" anchor="b" anchorCtr="0" forceAA="0" compatLnSpc="1">
+                            <a:prstTxWarp prst="textNoShape">
+                              <a:avLst/>
+                            </a:prstTxWarp>
+                            <a:noAutofit/>
+                          </wps:bodyPr>
+                        </wps:wsp>
+                      </a:graphicData>
+                    </a:graphic>
+                    <wp14:sizeRelH relativeFrom="page">
+                      <wp14:pctWidth>94100</wp14:pctWidth>
+                    </wp14:sizeRelH>
+                    <wp14:sizeRelV relativeFrom="page">
+                      <wp14:pctHeight>36300</wp14:pctHeight>
+                    </wp14:sizeRelV>
+                  </wp:anchor>
+                </w:drawing>
+              </mc:Choice>
+              <mc:Fallback>
+                <w:pict>
+                  <v:shapetype w14:anchorId="107DA495" id="_x0000_t202" coordsize="21600,21600" o:spt="202" path="m,l,21600r21600,l21600,xe">
+                    <v:stroke joinstyle="miter"/>
+                    <v:path gradientshapeok="t" o:connecttype="rect"/>
+                  </v:shapetype>
+                  <v:shape id="Text Box 154" o:spid="_x0000_s1026" type="#_x0000_t202" style="position:absolute;margin-left:0;margin-top:0;width:8in;height:286.5pt;z-index:251660301;visibility:visible;mso-wrap-style:square;mso-width-percent:941;mso-height-percent:363;mso-top-percent:300;mso-wrap-distance-left:9pt;mso-wrap-distance-top:0;mso-wrap-distance-right:9pt;mso-wrap-distance-bottom:0;mso-position-horizontal:center;mso-position-horizontal-relative:page;mso-position-vertical-relative:page;mso-width-percent:941;mso-height-percent:363;mso-top-percent:300;mso-width-relative:page;mso-height-relative:page;v-text-anchor:bottom" o:gfxdata="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" filled="f" stroked="f" strokeweight=".5pt">
+                    <v:textbox inset="126pt,0,54pt,0">
+                      <w:txbxContent>
+                        <w:p>
+                          <w:pPr>
+                            <w:jc w:val="right"/>
+                            <w:rPr>
+                              <w:color w:val="156082" w:themeColor="accent1"/>
+                              <w:sz w:val="64"/>
+                              <w:szCs w:val="64"/>
+                            </w:rPr>
+                          </w:pPr>
+                          <w:sdt>
+                            <w:sdtPr>
+                              <w:rPr>
+                                <w:caps/>
+                                <w:color w:val="156082" w:themeColor="accent1"/>
+                                <w:sz w:val="64"/>
+                                <w:szCs w:val="64"/>
+                              </w:rPr>
+                              <w:alias w:val="Title"/>
+                              <w:tag w:val=""/>
+                              <w:id w:val="630141079"/>
+                              <w:dataBinding w:prefixMappings="xmlns:ns0='http://purl.org/dc/elements/1.1/' xmlns:ns1='http://schemas.openxmlformats.org/package/2006/metadata/core-properties' " w:xpath="/ns1:coreProperties[1]/ns0:title[1]" w:storeItemID="{6C3C8BC8-F283-45AE-878A-BAB7291924A1}"/>
+                              <w:text w:multiLine="1"/>
+                            </w:sdtPr>
+                            <w:sdtEndPr>
+                              <w:rPr>
+                                <w:caps w:val="0"/>
+                              </w:rPr>
+                            </w:sdtEndPr>
+                            <w:sdtContent>
+                              <w:r>
+                                <w:rPr>
+                                  <w:caps/>
+                                  <w:color w:val="156082" w:themeColor="accent1"/>
+                                  <w:sz w:val="64"/>
+                                  <w:szCs w:val="64"/>
+                                </w:rPr>
+                                <w:t>UBarbershop</w:t>
+                              </w:r>
+                            </w:sdtContent>
+                          </w:sdt>
+                        </w:p>
+                        <w:sdt>
+                          <w:sdtPr>
+                            <w:rPr>
+                              <w:color w:val="404040" w:themeColor="text1" w:themeTint="BF"/>
+                              <w:sz w:val="36"/>
+                              <w:szCs w:val="36"/>
+                            </w:rPr>
+                            <w:alias w:val="Subtitle"/>
+                            <w:tag w:val=""/>
+                            <w:id w:val="1759551507"/>
+                            <w:dataBinding w:prefixMappings="xmlns:ns0='http://purl.org/dc/elements/1.1/' xmlns:ns1='http://schemas.openxmlformats.org/package/2006/metadata/core-properties' " w:xpath="/ns1:coreProperties[1]/ns0:subject[1]" w:storeItemID="{6C3C8BC8-F283-45AE-878A-BAB7291924A1}"/>
+                            <w:text/>
+                          </w:sdtPr>
+                          <w:sdtContent>
+                            <w:p>
+                              <w:pPr>
+                                <w:jc w:val="right"/>
+                                <w:rPr>
+                                  <w:smallCaps/>
+                                  <w:color w:val="404040" w:themeColor="text1" w:themeTint="BF"/>
+                                  <w:sz w:val="36"/>
+                                  <w:szCs w:val="36"/>
+                                </w:rPr>
+                              </w:pPr>
+                              <w:r>
+                                <w:rPr>
+                                  <w:color w:val="404040" w:themeColor="text1" w:themeTint="BF"/>
+                                  <w:sz w:val="36"/>
+                                  <w:szCs w:val="36"/>
+                                </w:rPr>
+                                <w:t>Deliverable 2</w:t>
+                              </w:r>
+                            </w:p>
+                          </w:sdtContent>
+                        </w:sdt>
+                      </w:txbxContent>
+                    </v:textbox>
+                    <w10:wrap type="square" anchorx="page" anchory="page"/>
+                  </v:shape>
+                </w:pict>
+              </mc:Fallback>
+            </mc:AlternateContent>
+          </w:r>
+        </w:p>
+        <w:p>
+          <w:r>
+            <w:rPr>
+              <w:noProof/>
+            </w:rPr>
+            <mc:AlternateContent>
+              <mc:Choice Requires="wps">
+                <w:drawing>
+                  <wp:anchor distT="0" distB="0" distL="114300" distR="114300" simplePos="0" relativeHeight="251662349" behindDoc="0" locked="0" layoutInCell="1" allowOverlap="1" wp14:anchorId="7A5FBE77" wp14:editId="19735267">
+                    <wp:simplePos x="0" y="0"/>
+                    <wp:positionH relativeFrom="page">
+                      <wp:align>left</wp:align>
+                    </wp:positionH>
+                    <wp:positionV relativeFrom="page">
+                      <wp:posOffset>7042068</wp:posOffset>
+                    </wp:positionV>
+                    <wp:extent cx="7539561" cy="1009650"/>
+                    <wp:effectExtent l="0" t="0" r="0" b="0"/>
+                    <wp:wrapSquare wrapText="bothSides"/>
+                    <wp:docPr id="153" name="Text Box 153"/>
+                    <wp:cNvGraphicFramePr/>
+                    <a:graphic xmlns:a="http://schemas.openxmlformats.org/drawingml/2006/main">
+                      <a:graphicData uri="http://schemas.microsoft.com/office/word/2010/wordprocessingShape">
+                        <wps:wsp>
+                          <wps:cNvSpPr txBox="1"/>
+                          <wps:spPr>
+                            <a:xfrm>
+                              <a:off x="0" y="0"/>
+                              <a:ext cx="7539561" cy="1009650"/>
+                            </a:xfrm>
+                            <a:prstGeom prst="rect">
+                              <a:avLst/>
+                            </a:prstGeom>
+                            <a:noFill/>
+                            <a:ln w="6350">
+                              <a:noFill/>
+                            </a:ln>
+                            <a:effectLst/>
+                          </wps:spPr>
+                          <wps:style>
+                            <a:lnRef idx="0">
+                              <a:schemeClr val="accent1"/>
+                            </a:lnRef>
+                            <a:fillRef idx="0">
+                              <a:schemeClr val="accent1"/>
+                            </a:fillRef>
+                            <a:effectRef idx="0">
+                              <a:schemeClr val="accent1"/>
+                            </a:effectRef>
+                            <a:fontRef idx="minor">
+                              <a:schemeClr val="dk1"/>
+                            </a:fontRef>
+                          </wps:style>
+                          <wps:txbx>
+                            <w:txbxContent>
+                              <w:p>
+                                <w:pPr>
+                                  <w:pStyle w:val="NoSpacing"/>
+                                  <w:jc w:val="right"/>
+                                  <w:rPr>
+                                    <w:color w:val="156082" w:themeColor="accent1"/>
+                                    <w:sz w:val="28"/>
+                                    <w:szCs w:val="28"/>
+                                  </w:rPr>
+                                </w:pPr>
+                                <w:r>
+                                  <w:rPr>
+                                    <w:color w:val="156082" w:themeColor="accent1"/>
+                                    <w:sz w:val="28"/>
+                                    <w:szCs w:val="28"/>
+                                  </w:rPr>
+                                  <w:t>Section 2</w:t>
+                                </w:r>
+                              </w:p>
+                              <w:sdt>
+                                <w:sdtPr>
+                                  <w:rPr>
+                                    <w:color w:val="595959" w:themeColor="text1" w:themeTint="A6"/>
+                                    <w:sz w:val="20"/>
+                                    <w:szCs w:val="20"/>
+                                  </w:rPr>
+                                  <w:alias w:val="Abstract"/>
+                                  <w:tag w:val=""/>
+                                  <w:id w:val="1375273687"/>
+                                  <w:dataBinding w:prefixMappings="xmlns:ns0='http://schemas.microsoft.com/office/2006/coverPageProps' " w:xpath="/ns0:CoverPageProperties[1]/ns0:Abstract[1]" w:storeItemID="{55AF091B-3C7A-41E3-B477-F2FDAA23CFDA}"/>
+                                  <w:text w:multiLine="1"/>
+                                </w:sdtPr>
+                                <w:sdtContent>
+                                  <w:p>
+                                    <w:pPr>
+                                      <w:pStyle w:val="NoSpacing"/>
+                                      <w:jc w:val="right"/>
+                                      <w:rPr>
+                                        <w:color w:val="595959" w:themeColor="text1" w:themeTint="A6"/>
+                                        <w:sz w:val="20"/>
+                                        <w:szCs w:val="20"/>
+                                      </w:rPr>
+                                    </w:pPr>
+                                    <w:r>
+                                      <w:rPr>
+                                        <w:color w:val="595959" w:themeColor="text1" w:themeTint="A6"/>
+                                        <w:sz w:val="20"/>
+                                        <w:szCs w:val="20"/>
+                                      </w:rPr>
+                                      <w:t>Used for booking appointments for the clients and internal use for the admin to add employees, services, days closed or employee vacations and look at all the booked appointments.</w:t>
+                                    </w:r>
+                                  </w:p>
+                                </w:sdtContent>
+                              </w:sdt>
+                            </w:txbxContent>
+                          </wps:txbx>
+                          <wps:bodyPr rot="0" spcFirstLastPara="0" vertOverflow="overflow" horzOverflow="overflow" vert="horz" wrap="square" lIns="1600200" tIns="0" rIns="685800" bIns="0" numCol="1" spcCol="0" rtlCol="0" fromWordArt="0" anchor="t" anchorCtr="0" forceAA="0" compatLnSpc="1">
+                            <a:prstTxWarp prst="textNoShape">
+                              <a:avLst/>
+                            </a:prstTxWarp>
+                            <a:spAutoFit/>
+                          </wps:bodyPr>
+                        </wps:wsp>
+                      </a:graphicData>
+                    </a:graphic>
+                    <wp14:sizeRelH relativeFrom="page">
+                      <wp14:pctWidth>0</wp14:pctWidth>
+                    </wp14:sizeRelH>
+                    <wp14:sizeRelV relativeFrom="page">
+                      <wp14:pctHeight>10000</wp14:pctHeight>
+                    </wp14:sizeRelV>
+                  </wp:anchor>
+                </w:drawing>
+              </mc:Choice>
+              <mc:Fallback>
+                <w:pict>
+                  <v:shape w14:anchorId="7A5FBE77" id="Text Box 153" o:spid="_x0000_s1027" type="#_x0000_t202" style="position:absolute;margin-left:0;margin-top:554.5pt;width:593.65pt;height:79.5pt;z-index:251662349;visibility:visible;mso-wrap-style:square;mso-width-percent:0;mso-height-percent:100;mso-wrap-distance-left:9pt;mso-wrap-distance-top:0;mso-wrap-distance-right:9pt;mso-wrap-distance-bottom:0;mso-position-horizontal:left;mso-position-horizontal-relative:page;mso-position-vertical:absolute;mso-position-vertical-relative:page;mso-width-percent:0;mso-height-percent:100;mso-width-relative:page;mso-height-relative:page;v-text-anchor:top" o:gfxdata="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" filled="f" stroked="f" strokeweight=".5pt">
+                    <v:textbox style="mso-fit-shape-to-text:t" inset="126pt,0,54pt,0">
+                      <w:txbxContent>
+                        <w:p>
+                          <w:pPr>
+                            <w:pStyle w:val="NoSpacing"/>
+                            <w:jc w:val="right"/>
+                            <w:rPr>
+                              <w:color w:val="156082" w:themeColor="accent1"/>
+                              <w:sz w:val="28"/>
+                              <w:szCs w:val="28"/>
+                            </w:rPr>
+                          </w:pPr>
+                          <w:r>
+                            <w:rPr>
+                              <w:color w:val="156082" w:themeColor="accent1"/>
+                              <w:sz w:val="28"/>
+                              <w:szCs w:val="28"/>
+                            </w:rPr>
+                            <w:t>Section 2</w:t>
+                          </w:r>
+                        </w:p>
+                        <w:sdt>
+                          <w:sdtPr>
+                            <w:rPr>
+                              <w:color w:val="595959" w:themeColor="text1" w:themeTint="A6"/>
+                              <w:sz w:val="20"/>
+                              <w:szCs w:val="20"/>
+                            </w:rPr>
+                            <w:alias w:val="Abstract"/>
+                            <w:tag w:val=""/>
+                            <w:id w:val="1375273687"/>
+                            <w:dataBinding w:prefixMappings="xmlns:ns0='http://schemas.microsoft.com/office/2006/coverPageProps' " w:xpath="/ns0:CoverPageProperties[1]/ns0:Abstract[1]" w:storeItemID="{55AF091B-3C7A-41E3-B477-F2FDAA23CFDA}"/>
+                            <w:text w:multiLine="1"/>
+                          </w:sdtPr>
+                          <w:sdtContent>
+                            <w:p>
+                              <w:pPr>
+                                <w:pStyle w:val="NoSpacing"/>
+                                <w:jc w:val="right"/>
+                                <w:rPr>
+                                  <w:color w:val="595959" w:themeColor="text1" w:themeTint="A6"/>
+                                  <w:sz w:val="20"/>
+                                  <w:szCs w:val="20"/>
+                                </w:rPr>
+                              </w:pPr>
+                              <w:r>
+                                <w:rPr>
+                                  <w:color w:val="595959" w:themeColor="text1" w:themeTint="A6"/>
+                                  <w:sz w:val="20"/>
+                                  <w:szCs w:val="20"/>
+                                </w:rPr>
+                                <w:t>Used for booking appointments for the clients and internal use for the admin to add employees, services, days closed or employee vacations and look at all the booked appointments.</w:t>
+                              </w:r>
+                            </w:p>
+                          </w:sdtContent>
+                        </w:sdt>
+                      </w:txbxContent>
+                    </v:textbox>
+                    <w10:wrap type="square" anchorx="page" anchory="page"/>
+                  </v:shape>
+                </w:pict>
+              </mc:Fallback>
+            </mc:AlternateContent>
+          </w:r>
+          <w:r>
+            <w:rPr>
+              <w:noProof/>
+            </w:rPr>
+            <mc:AlternateContent>
+              <mc:Choice Requires="wps">
+                <w:drawing>
+                  <wp:anchor distT="0" distB="0" distL="114300" distR="114300" simplePos="0" relativeHeight="251661325" behindDoc="0" locked="0" layoutInCell="1" allowOverlap="1" wp14:anchorId="7BB8EC27" wp14:editId="310BA4AE">
+                    <wp:simplePos x="0" y="0"/>
+                    <wp:positionH relativeFrom="page">
+                      <wp:posOffset>391885</wp:posOffset>
+                    </wp:positionH>
+                    <wp:positionV relativeFrom="page">
+                      <wp:posOffset>8229600</wp:posOffset>
+                    </wp:positionV>
+                    <wp:extent cx="7147675" cy="914400"/>
+                    <wp:effectExtent l="0" t="0" r="0" b="8255"/>
+                    <wp:wrapSquare wrapText="bothSides"/>
+                    <wp:docPr id="152" name="Text Box 152"/>
+                    <wp:cNvGraphicFramePr/>
+                    <a:graphic xmlns:a="http://schemas.openxmlformats.org/drawingml/2006/main">
+                      <a:graphicData uri="http://schemas.microsoft.com/office/word/2010/wordprocessingShape">
+                        <wps:wsp>
+                          <wps:cNvSpPr txBox="1"/>
+                          <wps:spPr>
+                            <a:xfrm>
+                              <a:off x="0" y="0"/>
+                              <a:ext cx="7147675" cy="914400"/>
+                            </a:xfrm>
+                            <a:prstGeom prst="rect">
+                              <a:avLst/>
+                            </a:prstGeom>
+                            <a:noFill/>
+                            <a:ln w="6350">
+                              <a:noFill/>
+                            </a:ln>
+                            <a:effectLst/>
+                          </wps:spPr>
+                          <wps:style>
+                            <a:lnRef idx="0">
+                              <a:schemeClr val="accent1"/>
+                            </a:lnRef>
+                            <a:fillRef idx="0">
+                              <a:schemeClr val="accent1"/>
+                            </a:fillRef>
+                            <a:effectRef idx="0">
+                              <a:schemeClr val="accent1"/>
+                            </a:effectRef>
+                            <a:fontRef idx="minor">
+                              <a:schemeClr val="dk1"/>
+                            </a:fontRef>
+                          </wps:style>
+                          <wps:txbx>
+                            <w:txbxContent>
+                              <w:sdt>
+                                <w:sdtPr>
+                                  <w:rPr>
+                                    <w:color w:val="595959" w:themeColor="text1" w:themeTint="A6"/>
+                                    <w:sz w:val="28"/>
+                                    <w:szCs w:val="28"/>
+                                  </w:rPr>
+                                  <w:alias w:val="Author"/>
+                                  <w:tag w:val=""/>
+                                  <w:id w:val="789243997"/>
+                                  <w:dataBinding w:prefixMappings="xmlns:ns0='http://purl.org/dc/elements/1.1/' xmlns:ns1='http://schemas.openxmlformats.org/package/2006/metadata/core-properties' " w:xpath="/ns1:coreProperties[1]/ns0:creator[1]" w:storeItemID="{6C3C8BC8-F283-45AE-878A-BAB7291924A1}"/>
+                                  <w:text/>
+                                </w:sdtPr>
+                                <w:sdtContent>
+                                  <w:p>
+                                    <w:pPr>
+                                      <w:pStyle w:val="NoSpacing"/>
+                                      <w:jc w:val="right"/>
+                                      <w:rPr>
+                                        <w:color w:val="595959" w:themeColor="text1" w:themeTint="A6"/>
+                                        <w:sz w:val="28"/>
+                                        <w:szCs w:val="28"/>
+                                      </w:rPr>
+                                    </w:pPr>
+                                    <w:r>
+                                      <w:rPr>
+                                        <w:color w:val="595959" w:themeColor="text1" w:themeTint="A6"/>
+                                        <w:sz w:val="28"/>
+                                        <w:szCs w:val="28"/>
+                                      </w:rPr>
+                                      <w:t>Victor Fortin (6385988), Audréane Deschênes (2072658), Section 1: Jonathan Morin (6240678)</w:t>
+                                    </w:r>
+                                  </w:p>
+                                </w:sdtContent>
+                              </w:sdt>
+                              <w:p>
+                                <w:pPr>
+                                  <w:pStyle w:val="NoSpacing"/>
+                                  <w:jc w:val="right"/>
+                                  <w:rPr>
+                                    <w:color w:val="595959" w:themeColor="text1" w:themeTint="A6"/>
+                                    <w:sz w:val="18"/>
+                                    <w:szCs w:val="18"/>
+                                  </w:rPr>
+                                </w:pPr>
+                              </w:p>
+                            </w:txbxContent>
+                          </wps:txbx>
+                          <wps:bodyPr rot="0" spcFirstLastPara="0" vertOverflow="overflow" horzOverflow="overflow" vert="horz" wrap="square" lIns="1600200" tIns="0" rIns="685800" bIns="0" numCol="1" spcCol="0" rtlCol="0" fromWordArt="0" anchor="b" anchorCtr="0" forceAA="0" compatLnSpc="1">
+                            <a:prstTxWarp prst="textNoShape">
+                              <a:avLst/>
+                            </a:prstTxWarp>
+                            <a:noAutofit/>
+                          </wps:bodyPr>
+                        </wps:wsp>
+                      </a:graphicData>
+                    </a:graphic>
+                    <wp14:sizeRelH relativeFrom="page">
+                      <wp14:pctWidth>0</wp14:pctWidth>
+                    </wp14:sizeRelH>
+                    <wp14:sizeRelV relativeFrom="page">
+                      <wp14:pctHeight>9200</wp14:pctHeight>
+                    </wp14:sizeRelV>
+                  </wp:anchor>
+                </w:drawing>
+              </mc:Choice>
+              <mc:Fallback>
+                <w:pict>
+                  <v:shape w14:anchorId="7BB8EC27" id="Text Box 152" o:spid="_x0000_s1028" type="#_x0000_t202" style="position:absolute;margin-left:30.85pt;margin-top:9in;width:562.8pt;height:1in;z-index:251661325;visibility:visible;mso-wrap-style:square;mso-width-percent:0;mso-height-percent:92;mso-wrap-distance-left:9pt;mso-wrap-distance-top:0;mso-wrap-distance-right:9pt;mso-wrap-distance-bottom:0;mso-position-horizontal:absolute;mso-position-horizontal-relative:page;mso-position-vertical:absolute;mso-position-vertical-relative:page;mso-width-percent:0;mso-height-percent:92;mso-width-relative:page;mso-height-relative:page;v-text-anchor:bottom" o:gfxdata="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" filled="f" stroked="f" strokeweight=".5pt">
+                    <v:textbox inset="126pt,0,54pt,0">
+                      <w:txbxContent>
+                        <w:sdt>
+                          <w:sdtPr>
+                            <w:rPr>
+                              <w:color w:val="595959" w:themeColor="text1" w:themeTint="A6"/>
+                              <w:sz w:val="28"/>
+                              <w:szCs w:val="28"/>
+                            </w:rPr>
+                            <w:alias w:val="Author"/>
+                            <w:tag w:val=""/>
+                            <w:id w:val="789243997"/>
+                            <w:dataBinding w:prefixMappings="xmlns:ns0='http://purl.org/dc/elements/1.1/' xmlns:ns1='http://schemas.openxmlformats.org/package/2006/metadata/core-properties' " w:xpath="/ns1:coreProperties[1]/ns0:creator[1]" w:storeItemID="{6C3C8BC8-F283-45AE-878A-BAB7291924A1}"/>
+                            <w:text/>
+                          </w:sdtPr>
+                          <w:sdtContent>
+                            <w:p>
+                              <w:pPr>
+                                <w:pStyle w:val="NoSpacing"/>
+                                <w:jc w:val="right"/>
+                                <w:rPr>
+                                  <w:color w:val="595959" w:themeColor="text1" w:themeTint="A6"/>
+                                  <w:sz w:val="28"/>
+                                  <w:szCs w:val="28"/>
+                                </w:rPr>
+                              </w:pPr>
+                              <w:r>
+                                <w:rPr>
+                                  <w:color w:val="595959" w:themeColor="text1" w:themeTint="A6"/>
+                                  <w:sz w:val="28"/>
+                                  <w:szCs w:val="28"/>
+                                </w:rPr>
+                                <w:t>Victor Fortin (6385988), Audréane Deschênes (2072658), Section 1: Jonathan Morin (6240678)</w:t>
+                              </w:r>
+                            </w:p>
+                          </w:sdtContent>
+                        </w:sdt>
+                        <w:p>
+                          <w:pPr>
+                            <w:pStyle w:val="NoSpacing"/>
+                            <w:jc w:val="right"/>
+                            <w:rPr>
+                              <w:color w:val="595959" w:themeColor="text1" w:themeTint="A6"/>
+                              <w:sz w:val="18"/>
+                              <w:szCs w:val="18"/>
+                            </w:rPr>
+                          </w:pPr>
+                        </w:p>
+                      </w:txbxContent>
+                    </v:textbox>
+                    <w10:wrap type="square" anchorx="page" anchory="page"/>
+                  </v:shape>
+                </w:pict>
+              </mc:Fallback>
+            </mc:AlternateContent>
+          </w:r>
+          <w:r>
+            <w:br w:type="page"/>
+          </w:r>
+        </w:p>
+      </w:sdtContent>
+    </w:sdt>
     <w:p>
       <w:pPr>
         <w:sectPr>
-          <w:footerReference w:type="first" r:id="rId9"/>
+          <w:footerReference w:type="default" r:id="rId11"/>
+          <w:footerReference w:type="first" r:id="rId12"/>
+          <w:pgSz w:w="12240" w:h="15840"/>
+          <w:pgMar w:top="1440" w:right="1440" w:bottom="1440" w:left="1440" w:header="720" w:footer="720" w:gutter="0"/>
+          <w:pgNumType w:fmt="lowerRoman" w:start="0"/>
+          <w:cols w:space="720"/>
+          <w:titlePg/>
+          <w:docGrid w:linePitch="360"/>
+        </w:sectPr>
+      </w:pPr>
+    </w:p>
+    <w:bookmarkStart w:id="0" w:name="_Toc226443808" w:displacedByCustomXml="next"/>
+    <w:bookmarkStart w:id="1" w:name="_Toc226443696" w:displacedByCustomXml="next"/>
+    <w:bookmarkStart w:id="2" w:name="_Toc226443536" w:displacedByCustomXml="next"/>
+    <w:sdt>
+      <w:sdtPr>
+        <w:id w:val="372130184"/>
+        <w:docPartObj>
+          <w:docPartGallery w:val="Table of Contents"/>
+          <w:docPartUnique/>
+        </w:docPartObj>
+      </w:sdtPr>
+      <w:sdtEndPr>
+        <w:rPr>
+          <w:rFonts w:asciiTheme="minorHAnsi" w:eastAsiaTheme="minorHAnsi" w:hAnsiTheme="minorHAnsi" w:cstheme="minorBidi"/>
+          <w:b/>
+          <w:bCs/>
+          <w:noProof/>
+          <w:color w:val="auto"/>
+          <w:kern w:val="2"/>
+          <w:sz w:val="24"/>
+          <w:szCs w:val="24"/>
+          <w14:ligatures w14:val="standardContextual"/>
+        </w:rPr>
+      </w:sdtEndPr>
+      <w:sdtContent>
+        <w:p>
+          <w:pPr>
+            <w:pStyle w:val="TOCHeading"/>
+          </w:pPr>
+          <w:r>
+            <w:t>Table of Contents</w:t>
+          </w:r>
+        </w:p>
+        <w:p>
+          <w:pPr>
+            <w:pStyle w:val="TOC2"/>
+            <w:tabs>
+              <w:tab w:val="right" w:leader="dot" w:pos="9350"/>
+            </w:tabs>
+            <w:rPr>
+              <w:rFonts w:eastAsiaTheme="minorEastAsia"/>
+              <w:noProof/>
+            </w:rPr>
+          </w:pPr>
+          <w:r>
+            <w:fldChar w:fldCharType="begin"/>
+          </w:r>
+          <w:r>
+            <w:instrText xml:space="preserve"> TOC \o "1-3" \h \z \u </w:instrText>
+          </w:r>
+          <w:r>
+            <w:fldChar w:fldCharType="separate"/>
+          </w:r>
+          <w:hyperlink w:anchor="_Toc226448467" w:history="1">
+            <w:r>
+              <w:rPr>
+                <w:rStyle w:val="Hyperlink"/>
+                <w:noProof/>
+              </w:rPr>
+              <w:t>Team Journal</w:t>
+            </w:r>
+            <w:r>
+              <w:rPr>
+                <w:noProof/>
+                <w:webHidden/>
+              </w:rPr>
+              <w:tab/>
+            </w:r>
+            <w:r>
+              <w:rPr>
+                <w:noProof/>
+                <w:webHidden/>
+              </w:rPr>
+              <w:fldChar w:fldCharType="begin"/>
+            </w:r>
+            <w:r>
+              <w:rPr>
+                <w:noProof/>
+                <w:webHidden/>
+              </w:rPr>
+              <w:instrText xml:space="preserve"> PAGEREF _Toc226448467 \h </w:instrText>
+            </w:r>
+            <w:r>
+              <w:rPr>
+                <w:noProof/>
+                <w:webHidden/>
+              </w:rPr>
+            </w:r>
+            <w:r>
+              <w:rPr>
+                <w:noProof/>
+                <w:webHidden/>
+              </w:rPr>
+              <w:fldChar w:fldCharType="separate"/>
+            </w:r>
+            <w:r>
+              <w:rPr>
+                <w:noProof/>
+                <w:webHidden/>
+              </w:rPr>
+              <w:t>1</w:t>
+            </w:r>
+            <w:r>
+              <w:rPr>
+                <w:noProof/>
+                <w:webHidden/>
+              </w:rPr>
+              <w:fldChar w:fldCharType="end"/>
+            </w:r>
+          </w:hyperlink>
+        </w:p>
+        <w:p>
+          <w:pPr>
+            <w:pStyle w:val="TOC2"/>
+            <w:tabs>
+              <w:tab w:val="right" w:leader="dot" w:pos="9350"/>
+            </w:tabs>
+            <w:rPr>
+              <w:rFonts w:eastAsiaTheme="minorEastAsia"/>
+              <w:noProof/>
+            </w:rPr>
+          </w:pPr>
+          <w:hyperlink w:anchor="_Toc226448468" w:history="1">
+            <w:r>
+              <w:rPr>
+                <w:rStyle w:val="Hyperlink"/>
+                <w:noProof/>
+              </w:rPr>
+              <w:t>Web Application Design</w:t>
+            </w:r>
+            <w:r>
+              <w:rPr>
+                <w:noProof/>
+                <w:webHidden/>
+              </w:rPr>
+              <w:tab/>
+            </w:r>
+            <w:r>
+              <w:rPr>
+                <w:noProof/>
+                <w:webHidden/>
+              </w:rPr>
+              <w:fldChar w:fldCharType="begin"/>
+            </w:r>
+            <w:r>
+              <w:rPr>
+                <w:noProof/>
+                <w:webHidden/>
+              </w:rPr>
+              <w:instrText xml:space="preserve"> PAGEREF _Toc226448468 \h </w:instrText>
+            </w:r>
+            <w:r>
+              <w:rPr>
+                <w:noProof/>
+                <w:webHidden/>
+              </w:rPr>
+            </w:r>
+            <w:r>
+              <w:rPr>
+                <w:noProof/>
+                <w:webHidden/>
+              </w:rPr>
+              <w:fldChar w:fldCharType="separate"/>
+            </w:r>
+            <w:r>
+              <w:rPr>
+                <w:noProof/>
+                <w:webHidden/>
+              </w:rPr>
+              <w:t>1</w:t>
+            </w:r>
+            <w:r>
+              <w:rPr>
+                <w:noProof/>
+                <w:webHidden/>
+              </w:rPr>
+              <w:fldChar w:fldCharType="end"/>
+            </w:r>
+          </w:hyperlink>
+        </w:p>
+        <w:p>
+          <w:pPr>
+            <w:pStyle w:val="TOC2"/>
+            <w:tabs>
+              <w:tab w:val="right" w:leader="dot" w:pos="9350"/>
+            </w:tabs>
+            <w:rPr>
+              <w:rFonts w:eastAsiaTheme="minorEastAsia"/>
+              <w:noProof/>
+            </w:rPr>
+          </w:pPr>
+          <w:hyperlink w:anchor="_Toc226448469" w:history="1">
+            <w:r>
+              <w:rPr>
+                <w:rStyle w:val="Hyperlink"/>
+                <w:noProof/>
+              </w:rPr>
+              <w:t>Task Breakdown</w:t>
+            </w:r>
+            <w:r>
+              <w:rPr>
+                <w:noProof/>
+                <w:webHidden/>
+              </w:rPr>
+              <w:tab/>
+            </w:r>
+            <w:r>
+              <w:rPr>
+                <w:noProof/>
+                <w:webHidden/>
+              </w:rPr>
+              <w:fldChar w:fldCharType="begin"/>
+            </w:r>
+            <w:r>
+              <w:rPr>
+                <w:noProof/>
+                <w:webHidden/>
+              </w:rPr>
+              <w:instrText xml:space="preserve"> PAGEREF _Toc226448469 \h </w:instrText>
+            </w:r>
+            <w:r>
+              <w:rPr>
+                <w:noProof/>
+                <w:webHidden/>
+              </w:rPr>
+            </w:r>
+            <w:r>
+              <w:rPr>
+                <w:noProof/>
+                <w:webHidden/>
+              </w:rPr>
+              <w:fldChar w:fldCharType="separate"/>
+            </w:r>
+            <w:r>
+              <w:rPr>
+                <w:noProof/>
+                <w:webHidden/>
+              </w:rPr>
+              <w:t>7</w:t>
+            </w:r>
+            <w:r>
+              <w:rPr>
+                <w:noProof/>
+                <w:webHidden/>
+              </w:rPr>
+              <w:fldChar w:fldCharType="end"/>
+            </w:r>
+          </w:hyperlink>
+        </w:p>
+        <w:p>
+          <w:pPr>
+            <w:pStyle w:val="TOC2"/>
+            <w:tabs>
+              <w:tab w:val="right" w:leader="dot" w:pos="9350"/>
+            </w:tabs>
+            <w:rPr>
+              <w:rFonts w:eastAsiaTheme="minorEastAsia"/>
+              <w:noProof/>
+            </w:rPr>
+          </w:pPr>
+          <w:hyperlink w:anchor="_Toc226448470" w:history="1">
+            <w:r>
+              <w:rPr>
+                <w:rStyle w:val="Hyperlink"/>
+                <w:noProof/>
+              </w:rPr>
+              <w:t>Tools &amp; Technologies</w:t>
+            </w:r>
+            <w:r>
+              <w:rPr>
+                <w:noProof/>
+                <w:webHidden/>
+              </w:rPr>
+              <w:tab/>
+            </w:r>
+            <w:r>
+              <w:rPr>
+                <w:noProof/>
+                <w:webHidden/>
+              </w:rPr>
+              <w:fldChar w:fldCharType="begin"/>
+            </w:r>
+            <w:r>
+              <w:rPr>
+                <w:noProof/>
+                <w:webHidden/>
+              </w:rPr>
+              <w:instrText xml:space="preserve"> PAGEREF _Toc226448470 \h </w:instrText>
+            </w:r>
+            <w:r>
+              <w:rPr>
+                <w:noProof/>
+                <w:webHidden/>
+              </w:rPr>
+            </w:r>
+            <w:r>
+              <w:rPr>
+                <w:noProof/>
+                <w:webHidden/>
+              </w:rPr>
+              <w:fldChar w:fldCharType="separate"/>
+            </w:r>
+            <w:r>
+              <w:rPr>
+                <w:noProof/>
+                <w:webHidden/>
+              </w:rPr>
+              <w:t>8</w:t>
+            </w:r>
+            <w:r>
+              <w:rPr>
+                <w:noProof/>
+                <w:webHidden/>
+              </w:rPr>
+              <w:fldChar w:fldCharType="end"/>
+            </w:r>
+          </w:hyperlink>
+        </w:p>
+        <w:p>
+          <w:r>
+            <w:rPr>
+              <w:b/>
+              <w:bCs/>
+              <w:noProof/>
+            </w:rPr>
+            <w:fldChar w:fldCharType="end"/>
+          </w:r>
+        </w:p>
+      </w:sdtContent>
+    </w:sdt>
+    <w:p>
+      <w:pPr>
+        <w:pStyle w:val="Heading2"/>
+        <w:sectPr>
+          <w:footerReference w:type="first" r:id="rId13"/>
           <w:pgSz w:w="12240" w:h="15840"/>
           <w:pgMar w:top="1440" w:right="1440" w:bottom="1440" w:left="1440" w:header="720" w:footer="720" w:gutter="0"/>
           <w:pgNumType w:fmt="lowerRoman" w:start="1"/>
@@ -19,16 +1276,15 @@
       <w:pPr>
         <w:pStyle w:val="Heading2"/>
       </w:pPr>
-      <w:bookmarkStart w:id="0" w:name="_Toc226443536"/>
-      <w:bookmarkStart w:id="1" w:name="_Toc226443696"/>
-      <w:bookmarkStart w:id="2" w:name="_Toc226443808"/>
+      <w:bookmarkStart w:id="3" w:name="_Toc226448467"/>
       <w:r>
         <w:lastRenderedPageBreak/>
         <w:t>Team Journal</w:t>
       </w:r>
+      <w:bookmarkEnd w:id="2"/>
+      <w:bookmarkEnd w:id="1"/>
       <w:bookmarkEnd w:id="0"/>
-      <w:bookmarkEnd w:id="1"/>
-      <w:bookmarkEnd w:id="2"/>
+      <w:bookmarkEnd w:id="3"/>
     </w:p>
     <w:p>
       <w:r>
@@ -218,17 +1474,19 @@
           <w:rStyle w:val="Heading2Char"/>
         </w:rPr>
       </w:pPr>
-      <w:bookmarkStart w:id="3" w:name="_Toc226443537"/>
-      <w:bookmarkStart w:id="4" w:name="_Toc226443697"/>
-      <w:bookmarkStart w:id="5" w:name="_Toc226443809"/>
+      <w:bookmarkStart w:id="4" w:name="_Toc226443537"/>
+      <w:bookmarkStart w:id="5" w:name="_Toc226443697"/>
+      <w:bookmarkStart w:id="6" w:name="_Toc226443809"/>
+      <w:bookmarkStart w:id="7" w:name="_Toc226448468"/>
       <w:r>
         <w:rPr>
           <w:rStyle w:val="Heading2Char"/>
         </w:rPr>
         <w:t>Web Application Design</w:t>
       </w:r>
-      <w:bookmarkEnd w:id="3"/>
-      <w:bookmarkEnd w:id="5"/>
+      <w:bookmarkEnd w:id="4"/>
+      <w:bookmarkEnd w:id="6"/>
+      <w:bookmarkEnd w:id="7"/>
     </w:p>
     <w:p>
       <w:r>
@@ -268,7 +1526,7 @@
                     <pic:cNvPicPr/>
                   </pic:nvPicPr>
                   <pic:blipFill>
-                    <a:blip r:embed="rId10" cstate="print">
+                    <a:blip r:embed="rId14" cstate="print">
                       <a:extLst>
                         <a:ext uri="{28A0092B-C50C-407E-A947-70E740481C1C}">
                           <a14:useLocalDpi xmlns:a14="http://schemas.microsoft.com/office/drawing/2010/main" val="0"/>
@@ -338,7 +1596,7 @@
                     <pic:cNvPicPr/>
                   </pic:nvPicPr>
                   <pic:blipFill>
-                    <a:blip r:embed="rId11" cstate="print">
+                    <a:blip r:embed="rId15" cstate="print">
                       <a:extLst>
                         <a:ext uri="{28A0092B-C50C-407E-A947-70E740481C1C}">
                           <a14:useLocalDpi xmlns:a14="http://schemas.microsoft.com/office/drawing/2010/main" val="0"/>
@@ -395,7 +1653,7 @@
                     <pic:cNvPicPr/>
                   </pic:nvPicPr>
                   <pic:blipFill>
-                    <a:blip r:embed="rId12" cstate="print">
+                    <a:blip r:embed="rId16" cstate="print">
                       <a:extLst>
                         <a:ext uri="{28A0092B-C50C-407E-A947-70E740481C1C}">
                           <a14:useLocalDpi xmlns:a14="http://schemas.microsoft.com/office/drawing/2010/main" val="0"/>
@@ -442,241 +1700,6 @@
             <wp:effectExtent l="0" t="0" r="0" b="1270"/>
             <wp:wrapSquare wrapText="bothSides"/>
             <wp:docPr id="8" name="Picture 8"/>
-            <wp:cNvGraphicFramePr>
-              <a:graphicFrameLocks xmlns:a="http://schemas.openxmlformats.org/drawingml/2006/main" noChangeAspect="1"/>
-            </wp:cNvGraphicFramePr>
-            <a:graphic xmlns:a="http://schemas.openxmlformats.org/drawingml/2006/main">
-              <a:graphicData uri="http://schemas.openxmlformats.org/drawingml/2006/picture">
-                <pic:pic xmlns:pic="http://schemas.openxmlformats.org/drawingml/2006/picture">
-                  <pic:nvPicPr>
-                    <pic:cNvPr id="1" name=""/>
-                    <pic:cNvPicPr/>
-                  </pic:nvPicPr>
-                  <pic:blipFill>
-                    <a:blip r:embed="rId13" cstate="print">
-                      <a:extLst>
-                        <a:ext uri="{28A0092B-C50C-407E-A947-70E740481C1C}">
-                          <a14:useLocalDpi xmlns:a14="http://schemas.microsoft.com/office/drawing/2010/main" val="0"/>
-                        </a:ext>
-                      </a:extLst>
-                    </a:blip>
-                    <a:stretch>
-                      <a:fillRect/>
-                    </a:stretch>
-                  </pic:blipFill>
-                  <pic:spPr>
-                    <a:xfrm>
-                      <a:off x="0" y="0"/>
-                      <a:ext cx="5943600" cy="2818130"/>
-                    </a:xfrm>
-                    <a:prstGeom prst="rect">
-                      <a:avLst/>
-                    </a:prstGeom>
-                  </pic:spPr>
-                </pic:pic>
-              </a:graphicData>
-            </a:graphic>
-          </wp:anchor>
-        </w:drawing>
-      </w:r>
-    </w:p>
-    <w:p/>
-    <w:p>
-      <w:r>
-        <w:drawing>
-          <wp:anchor distT="0" distB="0" distL="114300" distR="114300" simplePos="0" relativeHeight="251658246" behindDoc="0" locked="0" layoutInCell="1" allowOverlap="1" wp14:anchorId="142EBC23" wp14:editId="1EB84D74">
-            <wp:simplePos x="0" y="0"/>
-            <wp:positionH relativeFrom="margin">
-              <wp:align>right</wp:align>
-            </wp:positionH>
-            <wp:positionV relativeFrom="paragraph">
-              <wp:posOffset>415365</wp:posOffset>
-            </wp:positionV>
-            <wp:extent cx="5943600" cy="2806065"/>
-            <wp:effectExtent l="0" t="0" r="0" b="0"/>
-            <wp:wrapSquare wrapText="bothSides"/>
-            <wp:docPr id="14" name="Picture 14"/>
-            <wp:cNvGraphicFramePr>
-              <a:graphicFrameLocks xmlns:a="http://schemas.openxmlformats.org/drawingml/2006/main" noChangeAspect="1"/>
-            </wp:cNvGraphicFramePr>
-            <a:graphic xmlns:a="http://schemas.openxmlformats.org/drawingml/2006/main">
-              <a:graphicData uri="http://schemas.openxmlformats.org/drawingml/2006/picture">
-                <pic:pic xmlns:pic="http://schemas.openxmlformats.org/drawingml/2006/picture">
-                  <pic:nvPicPr>
-                    <pic:cNvPr id="1" name=""/>
-                    <pic:cNvPicPr/>
-                  </pic:nvPicPr>
-                  <pic:blipFill>
-                    <a:blip r:embed="rId14" cstate="print">
-                      <a:extLst>
-                        <a:ext uri="{28A0092B-C50C-407E-A947-70E740481C1C}">
-                          <a14:useLocalDpi xmlns:a14="http://schemas.microsoft.com/office/drawing/2010/main" val="0"/>
-                        </a:ext>
-                      </a:extLst>
-                    </a:blip>
-                    <a:stretch>
-                      <a:fillRect/>
-                    </a:stretch>
-                  </pic:blipFill>
-                  <pic:spPr>
-                    <a:xfrm>
-                      <a:off x="0" y="0"/>
-                      <a:ext cx="5943600" cy="2806065"/>
-                    </a:xfrm>
-                    <a:prstGeom prst="rect">
-                      <a:avLst/>
-                    </a:prstGeom>
-                  </pic:spPr>
-                </pic:pic>
-              </a:graphicData>
-            </a:graphic>
-          </wp:anchor>
-        </w:drawing>
-      </w:r>
-    </w:p>
-    <w:p/>
-    <w:p/>
-    <w:p/>
-    <w:p/>
-    <w:p>
-      <w:r>
-        <w:lastRenderedPageBreak/>
-        <w:drawing>
-          <wp:anchor distT="0" distB="0" distL="114300" distR="114300" simplePos="0" relativeHeight="251658245" behindDoc="0" locked="0" layoutInCell="1" allowOverlap="1" wp14:anchorId="38A8803D" wp14:editId="23E2EEF1">
-            <wp:simplePos x="0" y="0"/>
-            <wp:positionH relativeFrom="margin">
-              <wp:align>right</wp:align>
-            </wp:positionH>
-            <wp:positionV relativeFrom="paragraph">
-              <wp:posOffset>246968</wp:posOffset>
-            </wp:positionV>
-            <wp:extent cx="5943600" cy="2814955"/>
-            <wp:effectExtent l="0" t="0" r="0" b="4445"/>
-            <wp:wrapSquare wrapText="bothSides"/>
-            <wp:docPr id="11" name="Picture 11"/>
-            <wp:cNvGraphicFramePr>
-              <a:graphicFrameLocks xmlns:a="http://schemas.openxmlformats.org/drawingml/2006/main" noChangeAspect="1"/>
-            </wp:cNvGraphicFramePr>
-            <a:graphic xmlns:a="http://schemas.openxmlformats.org/drawingml/2006/main">
-              <a:graphicData uri="http://schemas.openxmlformats.org/drawingml/2006/picture">
-                <pic:pic xmlns:pic="http://schemas.openxmlformats.org/drawingml/2006/picture">
-                  <pic:nvPicPr>
-                    <pic:cNvPr id="1" name=""/>
-                    <pic:cNvPicPr/>
-                  </pic:nvPicPr>
-                  <pic:blipFill>
-                    <a:blip r:embed="rId15" cstate="print">
-                      <a:extLst>
-                        <a:ext uri="{28A0092B-C50C-407E-A947-70E740481C1C}">
-                          <a14:useLocalDpi xmlns:a14="http://schemas.microsoft.com/office/drawing/2010/main" val="0"/>
-                        </a:ext>
-                      </a:extLst>
-                    </a:blip>
-                    <a:stretch>
-                      <a:fillRect/>
-                    </a:stretch>
-                  </pic:blipFill>
-                  <pic:spPr>
-                    <a:xfrm>
-                      <a:off x="0" y="0"/>
-                      <a:ext cx="5943600" cy="2814955"/>
-                    </a:xfrm>
-                    <a:prstGeom prst="rect">
-                      <a:avLst/>
-                    </a:prstGeom>
-                  </pic:spPr>
-                </pic:pic>
-              </a:graphicData>
-            </a:graphic>
-          </wp:anchor>
-        </w:drawing>
-      </w:r>
-    </w:p>
-    <w:p>
-      <w:bookmarkStart w:id="6" w:name="_Toc226443538"/>
-      <w:bookmarkStart w:id="7" w:name="_Toc226443698"/>
-      <w:bookmarkStart w:id="8" w:name="_Toc226443810"/>
-      <w:bookmarkEnd w:id="4"/>
-    </w:p>
-    <w:p>
-      <w:r>
-        <w:drawing>
-          <wp:anchor distT="0" distB="0" distL="114300" distR="114300" simplePos="0" relativeHeight="251658247" behindDoc="0" locked="0" layoutInCell="1" allowOverlap="1" wp14:anchorId="553F3626" wp14:editId="317C18E9">
-            <wp:simplePos x="0" y="0"/>
-            <wp:positionH relativeFrom="column">
-              <wp:posOffset>0</wp:posOffset>
-            </wp:positionH>
-            <wp:positionV relativeFrom="paragraph">
-              <wp:posOffset>2000</wp:posOffset>
-            </wp:positionV>
-            <wp:extent cx="5943600" cy="2814955"/>
-            <wp:effectExtent l="0" t="0" r="0" b="4445"/>
-            <wp:wrapSquare wrapText="bothSides"/>
-            <wp:docPr id="15" name="Picture 15"/>
-            <wp:cNvGraphicFramePr>
-              <a:graphicFrameLocks xmlns:a="http://schemas.openxmlformats.org/drawingml/2006/main" noChangeAspect="1"/>
-            </wp:cNvGraphicFramePr>
-            <a:graphic xmlns:a="http://schemas.openxmlformats.org/drawingml/2006/main">
-              <a:graphicData uri="http://schemas.openxmlformats.org/drawingml/2006/picture">
-                <pic:pic xmlns:pic="http://schemas.openxmlformats.org/drawingml/2006/picture">
-                  <pic:nvPicPr>
-                    <pic:cNvPr id="1" name=""/>
-                    <pic:cNvPicPr/>
-                  </pic:nvPicPr>
-                  <pic:blipFill>
-                    <a:blip r:embed="rId16" cstate="print">
-                      <a:extLst>
-                        <a:ext uri="{28A0092B-C50C-407E-A947-70E740481C1C}">
-                          <a14:useLocalDpi xmlns:a14="http://schemas.microsoft.com/office/drawing/2010/main" val="0"/>
-                        </a:ext>
-                      </a:extLst>
-                    </a:blip>
-                    <a:stretch>
-                      <a:fillRect/>
-                    </a:stretch>
-                  </pic:blipFill>
-                  <pic:spPr>
-                    <a:xfrm>
-                      <a:off x="0" y="0"/>
-                      <a:ext cx="5943600" cy="2814955"/>
-                    </a:xfrm>
-                    <a:prstGeom prst="rect">
-                      <a:avLst/>
-                    </a:prstGeom>
-                  </pic:spPr>
-                </pic:pic>
-              </a:graphicData>
-            </a:graphic>
-          </wp:anchor>
-        </w:drawing>
-      </w:r>
-    </w:p>
-    <w:p/>
-    <w:p/>
-    <w:p/>
-    <w:p/>
-    <w:p/>
-    <w:p>
-      <w:r>
-        <w:lastRenderedPageBreak/>
-        <w:t>When logged in as the admin:</w:t>
-      </w:r>
-    </w:p>
-    <w:p>
-      <w:r>
-        <w:drawing>
-          <wp:anchor distT="0" distB="0" distL="114300" distR="114300" simplePos="0" relativeHeight="251658248" behindDoc="0" locked="0" layoutInCell="1" allowOverlap="1" wp14:anchorId="720DB1B9" wp14:editId="71C01ACF">
-            <wp:simplePos x="0" y="0"/>
-            <wp:positionH relativeFrom="column">
-              <wp:posOffset>0</wp:posOffset>
-            </wp:positionH>
-            <wp:positionV relativeFrom="paragraph">
-              <wp:posOffset>-2966</wp:posOffset>
-            </wp:positionV>
-            <wp:extent cx="5943600" cy="2818130"/>
-            <wp:effectExtent l="0" t="0" r="0" b="1270"/>
-            <wp:wrapSquare wrapText="bothSides"/>
-            <wp:docPr id="16" name="Picture 16"/>
             <wp:cNvGraphicFramePr>
               <a:graphicFrameLocks xmlns:a="http://schemas.openxmlformats.org/drawingml/2006/main" noChangeAspect="1"/>
             </wp:cNvGraphicFramePr>
@@ -715,21 +1738,22 @@
         </w:drawing>
       </w:r>
     </w:p>
+    <w:p/>
     <w:p>
       <w:r>
         <w:drawing>
-          <wp:anchor distT="0" distB="0" distL="114300" distR="114300" simplePos="0" relativeHeight="251658249" behindDoc="0" locked="0" layoutInCell="1" allowOverlap="1" wp14:anchorId="1F4EC289" wp14:editId="0FDCB1E7">
+          <wp:anchor distT="0" distB="0" distL="114300" distR="114300" simplePos="0" relativeHeight="251658246" behindDoc="0" locked="0" layoutInCell="1" allowOverlap="1" wp14:anchorId="142EBC23" wp14:editId="1EB84D74">
             <wp:simplePos x="0" y="0"/>
-            <wp:positionH relativeFrom="column">
-              <wp:posOffset>0</wp:posOffset>
+            <wp:positionH relativeFrom="margin">
+              <wp:align>right</wp:align>
             </wp:positionH>
             <wp:positionV relativeFrom="paragraph">
-              <wp:posOffset>1659</wp:posOffset>
+              <wp:posOffset>415365</wp:posOffset>
             </wp:positionV>
-            <wp:extent cx="5943600" cy="2843530"/>
+            <wp:extent cx="5943600" cy="2806065"/>
             <wp:effectExtent l="0" t="0" r="0" b="0"/>
             <wp:wrapSquare wrapText="bothSides"/>
-            <wp:docPr id="19" name="Picture 19"/>
+            <wp:docPr id="14" name="Picture 14"/>
             <wp:cNvGraphicFramePr>
               <a:graphicFrameLocks xmlns:a="http://schemas.openxmlformats.org/drawingml/2006/main" noChangeAspect="1"/>
             </wp:cNvGraphicFramePr>
@@ -755,7 +1779,7 @@
                   <pic:spPr>
                     <a:xfrm>
                       <a:off x="0" y="0"/>
-                      <a:ext cx="5943600" cy="2843530"/>
+                      <a:ext cx="5943600" cy="2806065"/>
                     </a:xfrm>
                     <a:prstGeom prst="rect">
                       <a:avLst/>
@@ -772,23 +1796,22 @@
     <w:p/>
     <w:p/>
     <w:p/>
-    <w:p/>
-    <w:p/>
-    <w:p>
-      <w:r>
+    <w:p>
+      <w:r>
+        <w:lastRenderedPageBreak/>
         <w:drawing>
-          <wp:anchor distT="0" distB="0" distL="114300" distR="114300" simplePos="0" relativeHeight="251658250" behindDoc="0" locked="0" layoutInCell="1" allowOverlap="1" wp14:anchorId="5BC0A588" wp14:editId="3BC13951">
+          <wp:anchor distT="0" distB="0" distL="114300" distR="114300" simplePos="0" relativeHeight="251658245" behindDoc="0" locked="0" layoutInCell="1" allowOverlap="1" wp14:anchorId="38A8803D" wp14:editId="23E2EEF1">
             <wp:simplePos x="0" y="0"/>
-            <wp:positionH relativeFrom="column">
-              <wp:posOffset>0</wp:posOffset>
+            <wp:positionH relativeFrom="margin">
+              <wp:align>right</wp:align>
             </wp:positionH>
             <wp:positionV relativeFrom="paragraph">
-              <wp:posOffset>-2966</wp:posOffset>
+              <wp:posOffset>246968</wp:posOffset>
             </wp:positionV>
-            <wp:extent cx="5943600" cy="2818130"/>
-            <wp:effectExtent l="0" t="0" r="0" b="1270"/>
+            <wp:extent cx="5943600" cy="2814955"/>
+            <wp:effectExtent l="0" t="0" r="0" b="4445"/>
             <wp:wrapSquare wrapText="bothSides"/>
-            <wp:docPr id="22" name="Picture 22"/>
+            <wp:docPr id="11" name="Picture 11"/>
             <wp:cNvGraphicFramePr>
               <a:graphicFrameLocks xmlns:a="http://schemas.openxmlformats.org/drawingml/2006/main" noChangeAspect="1"/>
             </wp:cNvGraphicFramePr>
@@ -814,7 +1837,7 @@
                   <pic:spPr>
                     <a:xfrm>
                       <a:off x="0" y="0"/>
-                      <a:ext cx="5943600" cy="2818130"/>
+                      <a:ext cx="5943600" cy="2814955"/>
                     </a:xfrm>
                     <a:prstGeom prst="rect">
                       <a:avLst/>
@@ -827,22 +1850,27 @@
         </w:drawing>
       </w:r>
     </w:p>
-    <w:p/>
+    <w:p>
+      <w:bookmarkStart w:id="8" w:name="_Toc226443538"/>
+      <w:bookmarkStart w:id="9" w:name="_Toc226443698"/>
+      <w:bookmarkStart w:id="10" w:name="_Toc226443810"/>
+      <w:bookmarkEnd w:id="5"/>
+    </w:p>
     <w:p>
       <w:r>
         <w:drawing>
-          <wp:anchor distT="0" distB="0" distL="114300" distR="114300" simplePos="0" relativeHeight="251658251" behindDoc="0" locked="0" layoutInCell="1" allowOverlap="1" wp14:anchorId="2E02A775" wp14:editId="13C27CED">
+          <wp:anchor distT="0" distB="0" distL="114300" distR="114300" simplePos="0" relativeHeight="251658247" behindDoc="0" locked="0" layoutInCell="1" allowOverlap="1" wp14:anchorId="553F3626" wp14:editId="317C18E9">
             <wp:simplePos x="0" y="0"/>
             <wp:positionH relativeFrom="column">
               <wp:posOffset>0</wp:posOffset>
             </wp:positionH>
             <wp:positionV relativeFrom="paragraph">
-              <wp:posOffset>-1308</wp:posOffset>
+              <wp:posOffset>2000</wp:posOffset>
             </wp:positionV>
-            <wp:extent cx="5943600" cy="2832735"/>
-            <wp:effectExtent l="0" t="0" r="0" b="5715"/>
+            <wp:extent cx="5943600" cy="2814955"/>
+            <wp:effectExtent l="0" t="0" r="0" b="4445"/>
             <wp:wrapSquare wrapText="bothSides"/>
-            <wp:docPr id="23" name="Picture 23"/>
+            <wp:docPr id="15" name="Picture 15"/>
             <wp:cNvGraphicFramePr>
               <a:graphicFrameLocks xmlns:a="http://schemas.openxmlformats.org/drawingml/2006/main" noChangeAspect="1"/>
             </wp:cNvGraphicFramePr>
@@ -868,6 +1896,236 @@
                   <pic:spPr>
                     <a:xfrm>
                       <a:off x="0" y="0"/>
+                      <a:ext cx="5943600" cy="2814955"/>
+                    </a:xfrm>
+                    <a:prstGeom prst="rect">
+                      <a:avLst/>
+                    </a:prstGeom>
+                  </pic:spPr>
+                </pic:pic>
+              </a:graphicData>
+            </a:graphic>
+          </wp:anchor>
+        </w:drawing>
+      </w:r>
+    </w:p>
+    <w:p/>
+    <w:p/>
+    <w:p/>
+    <w:p/>
+    <w:p/>
+    <w:p>
+      <w:r>
+        <w:lastRenderedPageBreak/>
+        <w:t>When logged in as the admin:</w:t>
+      </w:r>
+    </w:p>
+    <w:p>
+      <w:r>
+        <w:drawing>
+          <wp:anchor distT="0" distB="0" distL="114300" distR="114300" simplePos="0" relativeHeight="251658248" behindDoc="0" locked="0" layoutInCell="1" allowOverlap="1" wp14:anchorId="720DB1B9" wp14:editId="71C01ACF">
+            <wp:simplePos x="0" y="0"/>
+            <wp:positionH relativeFrom="column">
+              <wp:posOffset>0</wp:posOffset>
+            </wp:positionH>
+            <wp:positionV relativeFrom="paragraph">
+              <wp:posOffset>-2966</wp:posOffset>
+            </wp:positionV>
+            <wp:extent cx="5943600" cy="2818130"/>
+            <wp:effectExtent l="0" t="0" r="0" b="1270"/>
+            <wp:wrapSquare wrapText="bothSides"/>
+            <wp:docPr id="16" name="Picture 16"/>
+            <wp:cNvGraphicFramePr>
+              <a:graphicFrameLocks xmlns:a="http://schemas.openxmlformats.org/drawingml/2006/main" noChangeAspect="1"/>
+            </wp:cNvGraphicFramePr>
+            <a:graphic xmlns:a="http://schemas.openxmlformats.org/drawingml/2006/main">
+              <a:graphicData uri="http://schemas.openxmlformats.org/drawingml/2006/picture">
+                <pic:pic xmlns:pic="http://schemas.openxmlformats.org/drawingml/2006/picture">
+                  <pic:nvPicPr>
+                    <pic:cNvPr id="1" name=""/>
+                    <pic:cNvPicPr/>
+                  </pic:nvPicPr>
+                  <pic:blipFill>
+                    <a:blip r:embed="rId21" cstate="print">
+                      <a:extLst>
+                        <a:ext uri="{28A0092B-C50C-407E-A947-70E740481C1C}">
+                          <a14:useLocalDpi xmlns:a14="http://schemas.microsoft.com/office/drawing/2010/main" val="0"/>
+                        </a:ext>
+                      </a:extLst>
+                    </a:blip>
+                    <a:stretch>
+                      <a:fillRect/>
+                    </a:stretch>
+                  </pic:blipFill>
+                  <pic:spPr>
+                    <a:xfrm>
+                      <a:off x="0" y="0"/>
+                      <a:ext cx="5943600" cy="2818130"/>
+                    </a:xfrm>
+                    <a:prstGeom prst="rect">
+                      <a:avLst/>
+                    </a:prstGeom>
+                  </pic:spPr>
+                </pic:pic>
+              </a:graphicData>
+            </a:graphic>
+          </wp:anchor>
+        </w:drawing>
+      </w:r>
+    </w:p>
+    <w:p>
+      <w:r>
+        <w:drawing>
+          <wp:anchor distT="0" distB="0" distL="114300" distR="114300" simplePos="0" relativeHeight="251658249" behindDoc="0" locked="0" layoutInCell="1" allowOverlap="1" wp14:anchorId="1F4EC289" wp14:editId="0FDCB1E7">
+            <wp:simplePos x="0" y="0"/>
+            <wp:positionH relativeFrom="column">
+              <wp:posOffset>0</wp:posOffset>
+            </wp:positionH>
+            <wp:positionV relativeFrom="paragraph">
+              <wp:posOffset>1659</wp:posOffset>
+            </wp:positionV>
+            <wp:extent cx="5943600" cy="2843530"/>
+            <wp:effectExtent l="0" t="0" r="0" b="0"/>
+            <wp:wrapSquare wrapText="bothSides"/>
+            <wp:docPr id="19" name="Picture 19"/>
+            <wp:cNvGraphicFramePr>
+              <a:graphicFrameLocks xmlns:a="http://schemas.openxmlformats.org/drawingml/2006/main" noChangeAspect="1"/>
+            </wp:cNvGraphicFramePr>
+            <a:graphic xmlns:a="http://schemas.openxmlformats.org/drawingml/2006/main">
+              <a:graphicData uri="http://schemas.openxmlformats.org/drawingml/2006/picture">
+                <pic:pic xmlns:pic="http://schemas.openxmlformats.org/drawingml/2006/picture">
+                  <pic:nvPicPr>
+                    <pic:cNvPr id="1" name=""/>
+                    <pic:cNvPicPr/>
+                  </pic:nvPicPr>
+                  <pic:blipFill>
+                    <a:blip r:embed="rId22" cstate="print">
+                      <a:extLst>
+                        <a:ext uri="{28A0092B-C50C-407E-A947-70E740481C1C}">
+                          <a14:useLocalDpi xmlns:a14="http://schemas.microsoft.com/office/drawing/2010/main" val="0"/>
+                        </a:ext>
+                      </a:extLst>
+                    </a:blip>
+                    <a:stretch>
+                      <a:fillRect/>
+                    </a:stretch>
+                  </pic:blipFill>
+                  <pic:spPr>
+                    <a:xfrm>
+                      <a:off x="0" y="0"/>
+                      <a:ext cx="5943600" cy="2843530"/>
+                    </a:xfrm>
+                    <a:prstGeom prst="rect">
+                      <a:avLst/>
+                    </a:prstGeom>
+                  </pic:spPr>
+                </pic:pic>
+              </a:graphicData>
+            </a:graphic>
+          </wp:anchor>
+        </w:drawing>
+      </w:r>
+    </w:p>
+    <w:p/>
+    <w:p/>
+    <w:p/>
+    <w:p/>
+    <w:p/>
+    <w:p/>
+    <w:p>
+      <w:r>
+        <w:drawing>
+          <wp:anchor distT="0" distB="0" distL="114300" distR="114300" simplePos="0" relativeHeight="251658250" behindDoc="0" locked="0" layoutInCell="1" allowOverlap="1" wp14:anchorId="5BC0A588" wp14:editId="3BC13951">
+            <wp:simplePos x="0" y="0"/>
+            <wp:positionH relativeFrom="column">
+              <wp:posOffset>0</wp:posOffset>
+            </wp:positionH>
+            <wp:positionV relativeFrom="paragraph">
+              <wp:posOffset>-2966</wp:posOffset>
+            </wp:positionV>
+            <wp:extent cx="5943600" cy="2818130"/>
+            <wp:effectExtent l="0" t="0" r="0" b="1270"/>
+            <wp:wrapSquare wrapText="bothSides"/>
+            <wp:docPr id="22" name="Picture 22"/>
+            <wp:cNvGraphicFramePr>
+              <a:graphicFrameLocks xmlns:a="http://schemas.openxmlformats.org/drawingml/2006/main" noChangeAspect="1"/>
+            </wp:cNvGraphicFramePr>
+            <a:graphic xmlns:a="http://schemas.openxmlformats.org/drawingml/2006/main">
+              <a:graphicData uri="http://schemas.openxmlformats.org/drawingml/2006/picture">
+                <pic:pic xmlns:pic="http://schemas.openxmlformats.org/drawingml/2006/picture">
+                  <pic:nvPicPr>
+                    <pic:cNvPr id="1" name=""/>
+                    <pic:cNvPicPr/>
+                  </pic:nvPicPr>
+                  <pic:blipFill>
+                    <a:blip r:embed="rId23" cstate="print">
+                      <a:extLst>
+                        <a:ext uri="{28A0092B-C50C-407E-A947-70E740481C1C}">
+                          <a14:useLocalDpi xmlns:a14="http://schemas.microsoft.com/office/drawing/2010/main" val="0"/>
+                        </a:ext>
+                      </a:extLst>
+                    </a:blip>
+                    <a:stretch>
+                      <a:fillRect/>
+                    </a:stretch>
+                  </pic:blipFill>
+                  <pic:spPr>
+                    <a:xfrm>
+                      <a:off x="0" y="0"/>
+                      <a:ext cx="5943600" cy="2818130"/>
+                    </a:xfrm>
+                    <a:prstGeom prst="rect">
+                      <a:avLst/>
+                    </a:prstGeom>
+                  </pic:spPr>
+                </pic:pic>
+              </a:graphicData>
+            </a:graphic>
+          </wp:anchor>
+        </w:drawing>
+      </w:r>
+    </w:p>
+    <w:p/>
+    <w:p>
+      <w:r>
+        <w:drawing>
+          <wp:anchor distT="0" distB="0" distL="114300" distR="114300" simplePos="0" relativeHeight="251658251" behindDoc="0" locked="0" layoutInCell="1" allowOverlap="1" wp14:anchorId="2E02A775" wp14:editId="13C27CED">
+            <wp:simplePos x="0" y="0"/>
+            <wp:positionH relativeFrom="column">
+              <wp:posOffset>0</wp:posOffset>
+            </wp:positionH>
+            <wp:positionV relativeFrom="paragraph">
+              <wp:posOffset>-1308</wp:posOffset>
+            </wp:positionV>
+            <wp:extent cx="5943600" cy="2832735"/>
+            <wp:effectExtent l="0" t="0" r="0" b="5715"/>
+            <wp:wrapSquare wrapText="bothSides"/>
+            <wp:docPr id="23" name="Picture 23"/>
+            <wp:cNvGraphicFramePr>
+              <a:graphicFrameLocks xmlns:a="http://schemas.openxmlformats.org/drawingml/2006/main" noChangeAspect="1"/>
+            </wp:cNvGraphicFramePr>
+            <a:graphic xmlns:a="http://schemas.openxmlformats.org/drawingml/2006/main">
+              <a:graphicData uri="http://schemas.openxmlformats.org/drawingml/2006/picture">
+                <pic:pic xmlns:pic="http://schemas.openxmlformats.org/drawingml/2006/picture">
+                  <pic:nvPicPr>
+                    <pic:cNvPr id="1" name=""/>
+                    <pic:cNvPicPr/>
+                  </pic:nvPicPr>
+                  <pic:blipFill>
+                    <a:blip r:embed="rId24" cstate="print">
+                      <a:extLst>
+                        <a:ext uri="{28A0092B-C50C-407E-A947-70E740481C1C}">
+                          <a14:useLocalDpi xmlns:a14="http://schemas.microsoft.com/office/drawing/2010/main" val="0"/>
+                        </a:ext>
+                      </a:extLst>
+                    </a:blip>
+                    <a:stretch>
+                      <a:fillRect/>
+                    </a:stretch>
+                  </pic:blipFill>
+                  <pic:spPr>
+                    <a:xfrm>
+                      <a:off x="0" y="0"/>
                       <a:ext cx="5943600" cy="2832735"/>
                     </a:xfrm>
                     <a:prstGeom prst="rect">
@@ -912,7 +2170,7 @@
                     <pic:cNvPicPr/>
                   </pic:nvPicPr>
                   <pic:blipFill>
-                    <a:blip r:embed="rId21" cstate="print">
+                    <a:blip r:embed="rId25" cstate="print">
                       <a:extLst>
                         <a:ext uri="{28A0092B-C50C-407E-A947-70E740481C1C}">
                           <a14:useLocalDpi xmlns:a14="http://schemas.microsoft.com/office/drawing/2010/main" val="0"/>
@@ -944,12 +2202,14 @@
       <w:pPr>
         <w:pStyle w:val="Heading2"/>
       </w:pPr>
+      <w:bookmarkStart w:id="11" w:name="_Toc226448469"/>
       <w:r>
         <w:t>Task Breakdown</w:t>
       </w:r>
-      <w:bookmarkEnd w:id="6"/>
-      <w:bookmarkEnd w:id="7"/>
       <w:bookmarkEnd w:id="8"/>
+      <w:bookmarkEnd w:id="9"/>
+      <w:bookmarkEnd w:id="10"/>
+      <w:bookmarkEnd w:id="11"/>
     </w:p>
     <w:p>
       <w:pPr>
@@ -1301,10 +2561,12 @@
       <w:pPr>
         <w:pStyle w:val="Heading2"/>
       </w:pPr>
+      <w:bookmarkStart w:id="12" w:name="_Toc226448470"/>
       <w:r>
         <w:lastRenderedPageBreak/>
         <w:t>Tools &amp; Technologies</w:t>
       </w:r>
+      <w:bookmarkEnd w:id="12"/>
     </w:p>
     <w:p>
       <w:r>
@@ -1421,7 +2683,6 @@
     <w:p/>
     <w:p/>
     <w:sectPr>
-      <w:footerReference w:type="first" r:id="rId22"/>
       <w:pgSz w:w="12240" w:h="15840"/>
       <w:pgMar w:top="1440" w:right="1440" w:bottom="1440" w:left="1440" w:header="720" w:footer="720" w:gutter="0"/>
       <w:pgNumType w:start="1"/>
@@ -1466,6 +2727,59 @@
 </file>
 
 <file path=word/footer1.xml><?xml version="1.0" encoding="utf-8"?>
+<w:ftr xmlns:wpc="http://schemas.microsoft.com/office/word/2010/wordprocessingCanvas" xmlns:cx="http://schemas.microsoft.com/office/drawing/2014/chartex" xmlns:cx1="http://schemas.microsoft.com/office/drawing/2015/9/8/chartex" xmlns:cx2="http://schemas.microsoft.com/office/drawing/2015/10/21/chartex" xmlns:cx3="http://schemas.microsoft.com/office/drawing/2016/5/9/chartex" xmlns:cx4="http://schemas.microsoft.com/office/drawing/2016/5/10/chartex" xmlns:cx5="http://schemas.microsoft.com/office/drawing/2016/5/11/chartex" xmlns:cx6="http://schemas.microsoft.com/office/drawing/2016/5/12/chartex" xmlns:cx7="http://schemas.microsoft.com/office/drawing/2016/5/13/chartex" xmlns:cx8="http://schemas.microsoft.com/office/drawing/2016/5/14/chartex" xmlns:mc="http://schemas.openxmlformats.org/markup-compatibility/2006" xmlns:aink="http://schemas.microsoft.com/office/drawing/2016/ink" xmlns:am3d="http://schemas.microsoft.com/office/drawing/2017/model3d" xmlns:o="urn:schemas-microsoft-com:office:office" xmlns:oel="http://schemas.microsoft.com/office/2019/extlst" xmlns:r="http://schemas.openxmlformats.org/officeDocument/2006/relationships" xmlns:m="http://schemas.openxmlformats.org/officeDocument/2006/math" xmlns:v="urn:schemas-microsoft-com:vml" xmlns:wp14="http://schemas.microsoft.com/office/word/2010/wordprocessingDrawing" xmlns:wp="http://schemas.openxmlformats.org/drawingml/2006/wordprocessingDrawing" xmlns:w10="urn:schemas-microsoft-com:office:word" xmlns:w="http://schemas.openxmlformats.org/wordprocessingml/2006/main" xmlns:w14="http://schemas.microsoft.com/office/word/2010/wordml" xmlns:w15="http://schemas.microsoft.com/office/word/2012/wordml" xmlns:w16cex="http://schemas.microsoft.com/office/word/2018/wordml/cex" xmlns:w16cid="http://schemas.microsoft.com/office/word/2016/wordml/cid" xmlns:w16="http://schemas.microsoft.com/office/word/2018/wordml" xmlns:w16sdtdh="http://schemas.microsoft.com/office/word/2020/wordml/sdtdatahash" xmlns:w16se="http://schemas.microsoft.com/office/word/2015/wordml/symex" xmlns:wpg="http://schemas.microsoft.com/office/word/2010/wordprocessingGroup" xmlns:wpi="http://schemas.microsoft.com/office/word/2010/wordprocessingInk" xmlns:wne="http://schemas.microsoft.com/office/word/2006/wordml" xmlns:wps="http://schemas.microsoft.com/office/word/2010/wordprocessingShape" mc:Ignorable="w14 w15 w16se w16cid w16 w16cex w16sdtdh wp14">
+  <w:sdt>
+    <w:sdtPr>
+      <w:id w:val="2064520666"/>
+      <w:docPartObj>
+        <w:docPartGallery w:val="Page Numbers (Bottom of Page)"/>
+        <w:docPartUnique/>
+      </w:docPartObj>
+    </w:sdtPr>
+    <w:sdtEndPr>
+      <w:rPr>
+        <w:noProof/>
+      </w:rPr>
+    </w:sdtEndPr>
+    <w:sdtContent>
+      <w:p>
+        <w:pPr>
+          <w:pStyle w:val="Footer"/>
+          <w:jc w:val="right"/>
+        </w:pPr>
+        <w:r>
+          <w:fldChar w:fldCharType="begin"/>
+        </w:r>
+        <w:r>
+          <w:instrText xml:space="preserve"> PAGE   \* MERGEFORMAT </w:instrText>
+        </w:r>
+        <w:r>
+          <w:fldChar w:fldCharType="separate"/>
+        </w:r>
+        <w:r>
+          <w:rPr>
+            <w:noProof/>
+          </w:rPr>
+          <w:t>2</w:t>
+        </w:r>
+        <w:r>
+          <w:rPr>
+            <w:noProof/>
+          </w:rPr>
+          <w:fldChar w:fldCharType="end"/>
+        </w:r>
+      </w:p>
+    </w:sdtContent>
+  </w:sdt>
+  <w:p>
+    <w:pPr>
+      <w:pStyle w:val="Footer"/>
+    </w:pPr>
+  </w:p>
+</w:ftr>
+</file>
+
+<file path=word/footer2.xml><?xml version="1.0" encoding="utf-8"?>
 <w:ftr xmlns:wpc="http://schemas.microsoft.com/office/word/2010/wordprocessingCanvas" xmlns:cx="http://schemas.microsoft.com/office/drawing/2014/chartex" xmlns:cx1="http://schemas.microsoft.com/office/drawing/2015/9/8/chartex" xmlns:cx2="http://schemas.microsoft.com/office/drawing/2015/10/21/chartex" xmlns:cx3="http://schemas.microsoft.com/office/drawing/2016/5/9/chartex" xmlns:cx4="http://schemas.microsoft.com/office/drawing/2016/5/10/chartex" xmlns:cx5="http://schemas.microsoft.com/office/drawing/2016/5/11/chartex" xmlns:cx6="http://schemas.microsoft.com/office/drawing/2016/5/12/chartex" xmlns:cx7="http://schemas.microsoft.com/office/drawing/2016/5/13/chartex" xmlns:cx8="http://schemas.microsoft.com/office/drawing/2016/5/14/chartex" xmlns:mc="http://schemas.openxmlformats.org/markup-compatibility/2006" xmlns:aink="http://schemas.microsoft.com/office/drawing/2016/ink" xmlns:am3d="http://schemas.microsoft.com/office/drawing/2017/model3d" xmlns:o="urn:schemas-microsoft-com:office:office" xmlns:oel="http://schemas.microsoft.com/office/2019/extlst" xmlns:r="http://schemas.openxmlformats.org/officeDocument/2006/relationships" xmlns:m="http://schemas.openxmlformats.org/officeDocument/2006/math" xmlns:v="urn:schemas-microsoft-com:vml" xmlns:wp14="http://schemas.microsoft.com/office/word/2010/wordprocessingDrawing" xmlns:wp="http://schemas.openxmlformats.org/drawingml/2006/wordprocessingDrawing" xmlns:w10="urn:schemas-microsoft-com:office:word" xmlns:w="http://schemas.openxmlformats.org/wordprocessingml/2006/main" xmlns:w14="http://schemas.microsoft.com/office/word/2010/wordml" xmlns:w15="http://schemas.microsoft.com/office/word/2012/wordml" xmlns:w16cex="http://schemas.microsoft.com/office/word/2018/wordml/cex" xmlns:w16cid="http://schemas.microsoft.com/office/word/2016/wordml/cid" xmlns:w16="http://schemas.microsoft.com/office/word/2018/wordml" xmlns:w16sdtdh="http://schemas.microsoft.com/office/word/2020/wordml/sdtdatahash" xmlns:w16se="http://schemas.microsoft.com/office/word/2015/wordml/symex" xmlns:wpg="http://schemas.microsoft.com/office/word/2010/wordprocessingGroup" xmlns:wpi="http://schemas.microsoft.com/office/word/2010/wordprocessingInk" xmlns:wne="http://schemas.microsoft.com/office/word/2006/wordml" xmlns:wps="http://schemas.microsoft.com/office/word/2010/wordprocessingShape" mc:Ignorable="w14 w15 w16se w16cid w16 w16cex w16sdtdh wp14">
   <w:p>
     <w:pPr>
@@ -1481,7 +2795,7 @@
 </w:ftr>
 </file>
 
-<file path=word/footer2.xml><?xml version="1.0" encoding="utf-8"?>
+<file path=word/footer3.xml><?xml version="1.0" encoding="utf-8"?>
 <w:ftr xmlns:wpc="http://schemas.microsoft.com/office/word/2010/wordprocessingCanvas" xmlns:cx="http://schemas.microsoft.com/office/drawing/2014/chartex" xmlns:cx1="http://schemas.microsoft.com/office/drawing/2015/9/8/chartex" xmlns:cx2="http://schemas.microsoft.com/office/drawing/2015/10/21/chartex" xmlns:cx3="http://schemas.microsoft.com/office/drawing/2016/5/9/chartex" xmlns:cx4="http://schemas.microsoft.com/office/drawing/2016/5/10/chartex" xmlns:cx5="http://schemas.microsoft.com/office/drawing/2016/5/11/chartex" xmlns:cx6="http://schemas.microsoft.com/office/drawing/2016/5/12/chartex" xmlns:cx7="http://schemas.microsoft.com/office/drawing/2016/5/13/chartex" xmlns:cx8="http://schemas.microsoft.com/office/drawing/2016/5/14/chartex" xmlns:mc="http://schemas.openxmlformats.org/markup-compatibility/2006" xmlns:aink="http://schemas.microsoft.com/office/drawing/2016/ink" xmlns:am3d="http://schemas.microsoft.com/office/drawing/2017/model3d" xmlns:o="urn:schemas-microsoft-com:office:office" xmlns:oel="http://schemas.microsoft.com/office/2019/extlst" xmlns:r="http://schemas.openxmlformats.org/officeDocument/2006/relationships" xmlns:m="http://schemas.openxmlformats.org/officeDocument/2006/math" xmlns:v="urn:schemas-microsoft-com:vml" xmlns:wp14="http://schemas.microsoft.com/office/word/2010/wordprocessingDrawing" xmlns:wp="http://schemas.openxmlformats.org/drawingml/2006/wordprocessingDrawing" xmlns:w10="urn:schemas-microsoft-com:office:word" xmlns:w="http://schemas.openxmlformats.org/wordprocessingml/2006/main" xmlns:w14="http://schemas.microsoft.com/office/word/2010/wordml" xmlns:w15="http://schemas.microsoft.com/office/word/2012/wordml" xmlns:w16cex="http://schemas.microsoft.com/office/word/2018/wordml/cex" xmlns:w16cid="http://schemas.microsoft.com/office/word/2016/wordml/cid" xmlns:w16="http://schemas.microsoft.com/office/word/2018/wordml" xmlns:w16sdtdh="http://schemas.microsoft.com/office/word/2020/wordml/sdtdatahash" xmlns:w16se="http://schemas.microsoft.com/office/word/2015/wordml/symex" xmlns:wpg="http://schemas.microsoft.com/office/word/2010/wordprocessingGroup" xmlns:wpi="http://schemas.microsoft.com/office/word/2010/wordprocessingInk" xmlns:wne="http://schemas.microsoft.com/office/word/2006/wordml" xmlns:wps="http://schemas.microsoft.com/office/word/2010/wordprocessingShape" mc:Ignorable="w14 w15 w16se w16cid w16 w16cex w16sdtdh wp14">
   <w:sdt>
     <w:sdtPr>

</xml_diff>